<commit_message>
Finalización promptzal, corrección de indentificación de errores
</commit_message>
<xml_diff>
--- a/Manual de Usuario.docx
+++ b/Manual de Usuario.docx
@@ -32,12 +32,12 @@
             <wp:extent cx="2369185" cy="1352550"/>
             <wp:effectExtent b="0" l="0" r="0" t="0"/>
             <wp:wrapSquare wrapText="bothSides" distB="0" distT="0" distL="114300" distR="114300"/>
-            <wp:docPr id="26" name="image5.jpg"/>
+            <wp:docPr id="39" name="image1.jpg"/>
             <a:graphic>
               <a:graphicData uri="http://schemas.openxmlformats.org/drawingml/2006/picture">
                 <pic:pic>
                   <pic:nvPicPr>
-                    <pic:cNvPr id="0" name="image5.jpg"/>
+                    <pic:cNvPr id="0" name="image1.jpg"/>
                     <pic:cNvPicPr preferRelativeResize="0"/>
                   </pic:nvPicPr>
                   <pic:blipFill>
@@ -314,7 +314,7 @@
           <w:bCs w:val="1"/>
           <w:rtl w:val="0"/>
         </w:rPr>
-        <w:t xml:space="preserve">1</w:t>
+        <w:t xml:space="preserve">2</w:t>
       </w:r>
       <w:r>
         <w:rPr>
@@ -325,7 +325,7 @@
     <w:p>
       <w:pPr>
         <w:spacing w:after="26" w:line="360" w:lineRule="auto"/>
-        <w:ind w:left="10" w:right="32"/>
+        <w:ind w:left="10" w:right="32" w:firstLine="0"/>
         <w:jc w:val="center"/>
         <w:rPr>
           <w:rFonts w:ascii="Times New Roman" w:cs="Times New Roman" w:eastAsia="Times New Roman" w:hAnsi="Times New Roman"/>
@@ -467,8 +467,141 @@
           <w:rFonts w:ascii="Times New Roman" w:cs="Times New Roman" w:eastAsia="Times New Roman" w:hAnsi="Times New Roman"/>
           <w:rtl w:val="0"/>
         </w:rPr>
-        <w:t xml:space="preserve">Quetzaltenango, 16 de septiembre de 2026</w:t>
-      </w:r>
+        <w:t xml:space="preserve">Quetzaltenango, 28 de octubre de 2026</w:t>
+      </w:r>
+      <w:r>
+        <w:rPr>
+          <w:rtl w:val="0"/>
+        </w:rPr>
+      </w:r>
+    </w:p>
+    <w:p>
+      <w:pPr>
+        <w:spacing w:after="0" w:line="240" w:lineRule="auto"/>
+        <w:rPr>
+          <w:rFonts w:ascii="Times New Roman" w:cs="Times New Roman" w:eastAsia="Times New Roman" w:hAnsi="Times New Roman"/>
+        </w:rPr>
+      </w:pPr>
+      <w:r>
+        <w:rPr>
+          <w:rFonts w:ascii="Times New Roman" w:cs="Times New Roman" w:eastAsia="Times New Roman" w:hAnsi="Times New Roman"/>
+          <w:rtl w:val="0"/>
+        </w:rPr>
+        <w:t xml:space="preserve">Bienvenido al manual de usuario de PromptZa. Esta aplicación es un entorno de</w:t>
+      </w:r>
+    </w:p>
+    <w:p>
+      <w:pPr>
+        <w:spacing w:after="0" w:line="240" w:lineRule="auto"/>
+        <w:rPr>
+          <w:rFonts w:ascii="Times New Roman" w:cs="Times New Roman" w:eastAsia="Times New Roman" w:hAnsi="Times New Roman"/>
+        </w:rPr>
+      </w:pPr>
+      <w:r>
+        <w:rPr>
+          <w:rFonts w:ascii="Times New Roman" w:cs="Times New Roman" w:eastAsia="Times New Roman" w:hAnsi="Times New Roman"/>
+          <w:rtl w:val="0"/>
+        </w:rPr>
+        <w:t xml:space="preserve">desarrollo integrado diseñado para escribir, validar y compilar scripts en el lenguaje</w:t>
+      </w:r>
+    </w:p>
+    <w:p>
+      <w:pPr>
+        <w:spacing w:after="0" w:line="240" w:lineRule="auto"/>
+        <w:rPr>
+          <w:rFonts w:ascii="Times New Roman" w:cs="Times New Roman" w:eastAsia="Times New Roman" w:hAnsi="Times New Roman"/>
+        </w:rPr>
+      </w:pPr>
+      <w:r>
+        <w:rPr>
+          <w:rFonts w:ascii="Times New Roman" w:cs="Times New Roman" w:eastAsia="Times New Roman" w:hAnsi="Times New Roman"/>
+          <w:rtl w:val="0"/>
+        </w:rPr>
+        <w:t xml:space="preserve">PromptZal. Su propósito principal es generar instrucciones estructuradas en lenguaje</w:t>
+      </w:r>
+    </w:p>
+    <w:p>
+      <w:pPr>
+        <w:spacing w:after="0" w:line="240" w:lineRule="auto"/>
+        <w:rPr>
+          <w:rFonts w:ascii="Times New Roman" w:cs="Times New Roman" w:eastAsia="Times New Roman" w:hAnsi="Times New Roman"/>
+        </w:rPr>
+      </w:pPr>
+      <w:r>
+        <w:rPr>
+          <w:rFonts w:ascii="Times New Roman" w:cs="Times New Roman" w:eastAsia="Times New Roman" w:hAnsi="Times New Roman"/>
+          <w:rtl w:val="0"/>
+        </w:rPr>
+        <w:t xml:space="preserve">natural (prompts) que posteriormente pueden ser utilizadas en modelos de Inteligencia</w:t>
+      </w:r>
+    </w:p>
+    <w:p>
+      <w:pPr>
+        <w:spacing w:after="0" w:line="240" w:lineRule="auto"/>
+        <w:rPr>
+          <w:rFonts w:ascii="Times New Roman" w:cs="Times New Roman" w:eastAsia="Times New Roman" w:hAnsi="Times New Roman"/>
+        </w:rPr>
+      </w:pPr>
+      <w:r>
+        <w:rPr>
+          <w:rFonts w:ascii="Times New Roman" w:cs="Times New Roman" w:eastAsia="Times New Roman" w:hAnsi="Times New Roman"/>
+          <w:rtl w:val="0"/>
+        </w:rPr>
+        <w:t xml:space="preserve">Artificial (LLMs) como Claude.</w:t>
+      </w:r>
+    </w:p>
+    <w:p>
+      <w:pPr>
+        <w:spacing w:after="0" w:line="240" w:lineRule="auto"/>
+        <w:rPr>
+          <w:rFonts w:ascii="Times New Roman" w:cs="Times New Roman" w:eastAsia="Times New Roman" w:hAnsi="Times New Roman"/>
+        </w:rPr>
+      </w:pPr>
+      <w:r>
+        <w:rPr>
+          <w:rFonts w:ascii="Times New Roman" w:cs="Times New Roman" w:eastAsia="Times New Roman" w:hAnsi="Times New Roman"/>
+          <w:rtl w:val="0"/>
+        </w:rPr>
+        <w:t xml:space="preserve">La interfaz gráfica está diseñada para ser intuitiva, con un editor de código que cuenta</w:t>
+      </w:r>
+    </w:p>
+    <w:p>
+      <w:pPr>
+        <w:spacing w:after="0" w:line="240" w:lineRule="auto"/>
+        <w:rPr>
+          <w:rFonts w:ascii="Times New Roman" w:cs="Times New Roman" w:eastAsia="Times New Roman" w:hAnsi="Times New Roman"/>
+        </w:rPr>
+      </w:pPr>
+      <w:r>
+        <w:rPr>
+          <w:rFonts w:ascii="Times New Roman" w:cs="Times New Roman" w:eastAsia="Times New Roman" w:hAnsi="Times New Roman"/>
+          <w:rtl w:val="0"/>
+        </w:rPr>
+        <w:t xml:space="preserve">con resaltado de sintaxis, validación en tiempo real y generación automática de reportes</w:t>
+      </w:r>
+    </w:p>
+    <w:p>
+      <w:pPr>
+        <w:spacing w:after="0" w:line="240" w:lineRule="auto"/>
+        <w:rPr>
+          <w:rFonts w:ascii="Times New Roman" w:cs="Times New Roman" w:eastAsia="Times New Roman" w:hAnsi="Times New Roman"/>
+        </w:rPr>
+      </w:pPr>
+      <w:r>
+        <w:rPr>
+          <w:rFonts w:ascii="Times New Roman" w:cs="Times New Roman" w:eastAsia="Times New Roman" w:hAnsi="Times New Roman"/>
+          <w:rtl w:val="0"/>
+        </w:rPr>
+        <w:t xml:space="preserve">visuales.</w:t>
+      </w:r>
+    </w:p>
+    <w:p>
+      <w:pPr>
+        <w:spacing w:after="0" w:line="240" w:lineRule="auto"/>
+        <w:rPr>
+          <w:rFonts w:ascii="Times New Roman" w:cs="Times New Roman" w:eastAsia="Times New Roman" w:hAnsi="Times New Roman"/>
+        </w:rPr>
+      </w:pPr>
       <w:r>
         <w:rPr>
           <w:rtl w:val="0"/>
@@ -536,7 +669,7 @@
       <w:pPr>
         <w:numPr>
           <w:ilvl w:val="0"/>
-          <w:numId w:val="7"/>
+          <w:numId w:val="5"/>
         </w:numPr>
         <w:spacing w:after="0" w:line="240" w:lineRule="auto"/>
         <w:ind w:left="720" w:hanging="360"/>
@@ -553,7 +686,7 @@
           <w:bCs w:val="1"/>
           <w:rtl w:val="0"/>
         </w:rPr>
-        <w:t xml:space="preserve">Sensibilidad a Mayúsculas y Minúsculas (Case-sensitive):</w:t>
+        <w:t xml:space="preserve">Sensibilidad a Mayúsculas y Minúsculas :</w:t>
       </w:r>
       <w:r>
         <w:rPr>
@@ -561,13 +694,18 @@
           <w:rtl w:val="0"/>
         </w:rPr>
         <w:t xml:space="preserve"> El sistema distingue entre letras mayúsculas y minúsculas. Por ejemplo, la palabra "Agente" no es igual a "agente".</w:t>
+      </w:r>
+      <w:r>
+        <w:rPr>
+          <w:rtl w:val="0"/>
+        </w:rPr>
       </w:r>
     </w:p>
     <w:p>
       <w:pPr>
         <w:numPr>
           <w:ilvl w:val="0"/>
-          <w:numId w:val="7"/>
+          <w:numId w:val="5"/>
         </w:numPr>
         <w:spacing w:after="0" w:line="240" w:lineRule="auto"/>
         <w:ind w:left="720" w:hanging="360"/>
@@ -593,12 +731,17 @@
         </w:rPr>
         <w:t xml:space="preserve"> La aplicación solo trabaja con archivos que tengan la extensión .pz. Si intentas cargar un archivo con un formato diferente, el sistema no lo reconocerá.</w:t>
       </w:r>
+      <w:r>
+        <w:rPr>
+          <w:rtl w:val="0"/>
+        </w:rPr>
+      </w:r>
     </w:p>
     <w:p>
       <w:pPr>
         <w:numPr>
           <w:ilvl w:val="0"/>
-          <w:numId w:val="7"/>
+          <w:numId w:val="5"/>
         </w:numPr>
         <w:spacing w:after="0" w:line="240" w:lineRule="auto"/>
         <w:ind w:left="720" w:hanging="360"/>
@@ -623,6 +766,11 @@
           <w:rtl w:val="0"/>
         </w:rPr>
         <w:t xml:space="preserve"> El analizador léxico está diseñado para no detenerse. Si encuentra un error, lo registrará y continuará revisando el resto del archivo. Esto permite que recibas un diagnóstico completo de todos los problemas en una sola ejecución.</w:t>
+      </w:r>
+      <w:r>
+        <w:rPr>
+          <w:rtl w:val="0"/>
+        </w:rPr>
       </w:r>
     </w:p>
     <w:p>
@@ -685,12 +833,12 @@
           <wp:inline distB="114300" distT="114300" distL="114300" distR="114300">
             <wp:extent cx="4148138" cy="2745482"/>
             <wp:effectExtent b="0" l="0" r="0" t="0"/>
-            <wp:docPr id="22" name="image6.png"/>
+            <wp:docPr id="36" name="image14.png"/>
             <a:graphic>
               <a:graphicData uri="http://schemas.openxmlformats.org/drawingml/2006/picture">
                 <pic:pic>
                   <pic:nvPicPr>
-                    <pic:cNvPr id="0" name="image6.png"/>
+                    <pic:cNvPr id="0" name="image14.png"/>
                     <pic:cNvPicPr preferRelativeResize="0"/>
                   </pic:nvPicPr>
                   <pic:blipFill>
@@ -746,13 +894,25 @@
     </w:p>
     <w:p>
       <w:pPr>
+        <w:rPr>
+          <w:rFonts w:ascii="Times New Roman" w:cs="Times New Roman" w:eastAsia="Times New Roman" w:hAnsi="Times New Roman"/>
+        </w:rPr>
+      </w:pPr>
+      <w:r>
+        <w:rPr>
+          <w:rtl w:val="0"/>
+        </w:rPr>
+      </w:r>
+    </w:p>
+    <w:p>
+      <w:pPr>
         <w:keepNext w:val="0"/>
         <w:keepLines w:val="0"/>
         <w:pageBreakBefore w:val="0"/>
         <w:widowControl w:val="1"/>
         <w:numPr>
           <w:ilvl w:val="0"/>
-          <w:numId w:val="6"/>
+          <w:numId w:val="4"/>
         </w:numPr>
         <w:pBdr>
           <w:top w:space="0" w:sz="0" w:val="nil"/>
@@ -839,12 +999,12 @@
           <wp:inline distB="114300" distT="114300" distL="114300" distR="114300">
             <wp:extent cx="5943600" cy="1625600"/>
             <wp:effectExtent b="0" l="0" r="0" t="0"/>
-            <wp:docPr id="21" name="image2.png"/>
+            <wp:docPr id="35" name="image3.png"/>
             <a:graphic>
               <a:graphicData uri="http://schemas.openxmlformats.org/drawingml/2006/picture">
                 <pic:pic>
                   <pic:nvPicPr>
-                    <pic:cNvPr id="0" name="image2.png"/>
+                    <pic:cNvPr id="0" name="image3.png"/>
                     <pic:cNvPicPr preferRelativeResize="0"/>
                   </pic:nvPicPr>
                   <pic:blipFill>
@@ -947,6 +1107,11 @@
         </w:rPr>
         <w:t xml:space="preserve"> Windows 10/11 o distribuciones de Linux (Ubuntu, Fedora, etc.).</w:t>
       </w:r>
+      <w:r>
+        <w:rPr>
+          <w:rtl w:val="0"/>
+        </w:rPr>
+      </w:r>
     </w:p>
     <w:p>
       <w:pPr>
@@ -978,6 +1143,11 @@
         </w:rPr>
         <w:t xml:space="preserve"> Es el motor necesario para ejecutar la aplicación.</w:t>
       </w:r>
+      <w:r>
+        <w:rPr>
+          <w:rtl w:val="0"/>
+        </w:rPr>
+      </w:r>
     </w:p>
     <w:p>
       <w:pPr>
@@ -1007,7 +1177,7 @@
           <w:rFonts w:ascii="Times New Roman" w:cs="Times New Roman" w:eastAsia="Times New Roman" w:hAnsi="Times New Roman"/>
           <w:rtl w:val="0"/>
         </w:rPr>
-        <w:t xml:space="preserve"> Se recomienda tenerlo instalado para la correcta generación visual de los diagramas de autómatas.</w:t>
+        <w:t xml:space="preserve"> Se recomienda tenerlo instalado para la correcta generación visual del AST</w:t>
       </w:r>
       <w:r>
         <w:rPr>
@@ -1150,7 +1320,12 @@
           <w:rFonts w:ascii="Times New Roman" w:cs="Times New Roman" w:eastAsia="Times New Roman" w:hAnsi="Times New Roman"/>
           <w:rtl w:val="0"/>
         </w:rPr>
-        <w:t xml:space="preserve"> Aquí encontrarás las funciones principales: Abrir archivo para cargar tus proyectos, Analizar para iniciar la revisión, Guardar para registrar tus cambios y ReportesHTML para generar la documentación técnica.</w:t>
+        <w:t xml:space="preserve"> Aquí encontrarás las funciones principales: Abrir archivo para cargar tus proyectos, Compilar para ejecutar la compilación y crear el prompt, Guardar para registrar tus cambios, Ver AST para poder acceder a la imagen generada y Reportes para generar la documentación.</w:t>
+      </w:r>
+      <w:r>
+        <w:rPr>
+          <w:rtl w:val="0"/>
+        </w:rPr>
       </w:r>
     </w:p>
     <w:p>
@@ -1183,6 +1358,11 @@
         </w:rPr>
         <w:t xml:space="preserve"> Un espacio amplio para escribir o modificar tu código .pz, equipado con barras de desplazamiento para manejar textos extensos.</w:t>
       </w:r>
+      <w:r>
+        <w:rPr>
+          <w:rtl w:val="0"/>
+        </w:rPr>
+      </w:r>
     </w:p>
     <w:p>
       <w:pPr>
@@ -1214,6 +1394,11 @@
         </w:rPr>
         <w:t xml:space="preserve"> Un sistema de pestañas que organiza la información procesada.</w:t>
       </w:r>
+      <w:r>
+        <w:rPr>
+          <w:rtl w:val="0"/>
+        </w:rPr>
+      </w:r>
     </w:p>
     <w:p>
       <w:pPr>
@@ -1236,7 +1421,7 @@
           <w:bCs w:val="1"/>
           <w:rtl w:val="0"/>
         </w:rPr>
-        <w:t xml:space="preserve">Tokens reconocidos:</w:t>
+        <w:t xml:space="preserve">Tokens:</w:t>
       </w:r>
       <w:r>
         <w:rPr>
@@ -1244,6 +1429,11 @@
           <w:rtl w:val="0"/>
         </w:rPr>
         <w:t xml:space="preserve"> Muestra los componentes del lenguaje que el sistema entendió perfectamente.</w:t>
+      </w:r>
+      <w:r>
+        <w:rPr>
+          <w:rtl w:val="0"/>
+        </w:rPr>
       </w:r>
     </w:p>
     <w:p>
@@ -1267,7 +1457,7 @@
           <w:bCs w:val="1"/>
           <w:rtl w:val="0"/>
         </w:rPr>
-        <w:t xml:space="preserve">Errores léxicos:</w:t>
+        <w:t xml:space="preserve">Errores:</w:t>
       </w:r>
       <w:r>
         <w:rPr>
@@ -1275,6 +1465,11 @@
           <w:rtl w:val="0"/>
         </w:rPr>
         <w:t xml:space="preserve"> Lista detalladamente cualquier carácter o símbolo que no pertenezca al lenguaje.</w:t>
+      </w:r>
+      <w:r>
+        <w:rPr>
+          <w:rtl w:val="0"/>
+        </w:rPr>
       </w:r>
     </w:p>
     <w:p>
@@ -1290,14 +1485,14 @@
         </w:rPr>
         <w:drawing>
           <wp:inline distB="114300" distT="114300" distL="114300" distR="114300">
-            <wp:extent cx="5943600" cy="4572000"/>
+            <wp:extent cx="5063169" cy="4393043"/>
             <wp:effectExtent b="0" l="0" r="0" t="0"/>
-            <wp:docPr id="20" name="image1.png"/>
+            <wp:docPr id="33" name="image11.png"/>
             <a:graphic>
               <a:graphicData uri="http://schemas.openxmlformats.org/drawingml/2006/picture">
                 <pic:pic>
                   <pic:nvPicPr>
-                    <pic:cNvPr id="0" name="image1.png"/>
+                    <pic:cNvPr id="0" name="image11.png"/>
                     <pic:cNvPicPr preferRelativeResize="0"/>
                   </pic:nvPicPr>
                   <pic:blipFill>
@@ -1310,7 +1505,7 @@
                   <pic:spPr>
                     <a:xfrm>
                       <a:off x="0" y="0"/>
-                      <a:ext cx="5943600" cy="4572000"/>
+                      <a:ext cx="5063169" cy="4393043"/>
                     </a:xfrm>
                     <a:prstGeom prst="rect"/>
                     <a:ln/>
@@ -1487,6 +1682,8 @@
       <w:pPr>
         <w:rPr>
           <w:rFonts w:ascii="Times New Roman" w:cs="Times New Roman" w:eastAsia="Times New Roman" w:hAnsi="Times New Roman"/>
+          <w:b w:val="1"/>
+          <w:bCs w:val="1"/>
         </w:rPr>
       </w:pPr>
       <w:r>
@@ -1499,12 +1696,12 @@
           <wp:inline distB="114300" distT="114300" distL="114300" distR="114300">
             <wp:extent cx="5943600" cy="4521200"/>
             <wp:effectExtent b="0" l="0" r="0" t="0"/>
-            <wp:docPr id="25" name="image8.png"/>
+            <wp:docPr id="37" name="image10.png"/>
             <a:graphic>
               <a:graphicData uri="http://schemas.openxmlformats.org/drawingml/2006/picture">
                 <pic:pic>
                   <pic:nvPicPr>
-                    <pic:cNvPr id="0" name="image8.png"/>
+                    <pic:cNvPr id="0" name="image10.png"/>
                     <pic:cNvPicPr preferRelativeResize="0"/>
                   </pic:nvPicPr>
                   <pic:blipFill>
@@ -1538,103 +1735,165 @@
       <w:pPr>
         <w:rPr>
           <w:rFonts w:ascii="Times New Roman" w:cs="Times New Roman" w:eastAsia="Times New Roman" w:hAnsi="Times New Roman"/>
-        </w:rPr>
-      </w:pPr>
-      <w:r>
-        <w:rPr>
-          <w:rtl w:val="0"/>
-        </w:rPr>
-      </w:r>
-    </w:p>
-    <w:p>
-      <w:pPr>
-        <w:rPr>
-          <w:rFonts w:ascii="Times New Roman" w:cs="Times New Roman" w:eastAsia="Times New Roman" w:hAnsi="Times New Roman"/>
-          <w:b w:val="1"/>
-          <w:bCs w:val="1"/>
-        </w:rPr>
-      </w:pPr>
-      <w:r>
-        <w:rPr>
-          <w:rFonts w:ascii="Times New Roman" w:cs="Times New Roman" w:eastAsia="Times New Roman" w:hAnsi="Times New Roman"/>
-          <w:b w:val="1"/>
-          <w:bCs w:val="1"/>
-          <w:rtl w:val="0"/>
-        </w:rPr>
-        <w:t xml:space="preserve">Paso 3: Análisis del código </w:t>
-      </w:r>
-    </w:p>
-    <w:p>
-      <w:pPr>
-        <w:spacing w:after="0" w:line="240" w:lineRule="auto"/>
-        <w:rPr>
-          <w:rFonts w:ascii="Times New Roman" w:cs="Times New Roman" w:eastAsia="Times New Roman" w:hAnsi="Times New Roman"/>
-        </w:rPr>
-      </w:pPr>
-      <w:r>
-        <w:rPr>
-          <w:rFonts w:ascii="Times New Roman" w:cs="Times New Roman" w:eastAsia="Times New Roman" w:hAnsi="Times New Roman"/>
-          <w:rtl w:val="0"/>
-        </w:rPr>
-        <w:t xml:space="preserve">Presiona el botón Analizar. El sistema procesará el texto y mostrará un mensaje emergente:</w:t>
-      </w:r>
-    </w:p>
-    <w:p>
-      <w:pPr>
-        <w:widowControl w:val="0"/>
-        <w:spacing w:after="0" w:line="240" w:lineRule="auto"/>
-        <w:rPr>
-          <w:rFonts w:ascii="Times New Roman" w:cs="Times New Roman" w:eastAsia="Times New Roman" w:hAnsi="Times New Roman"/>
-        </w:rPr>
-      </w:pPr>
-      <w:r>
-        <w:rPr>
-          <w:rtl w:val="0"/>
-        </w:rPr>
-      </w:r>
-    </w:p>
-    <w:p>
-      <w:pPr>
-        <w:numPr>
-          <w:ilvl w:val="0"/>
-          <w:numId w:val="4"/>
-        </w:numPr>
-        <w:spacing w:after="0" w:line="240" w:lineRule="auto"/>
-        <w:ind w:left="720" w:hanging="360"/>
-        <w:rPr>
-          <w:rFonts w:ascii="Times New Roman" w:cs="Times New Roman" w:eastAsia="Times New Roman" w:hAnsi="Times New Roman"/>
-          <w:sz w:val="22"/>
-          <w:szCs w:val="22"/>
-        </w:rPr>
-      </w:pPr>
-      <w:r>
-        <w:rPr>
-          <w:rFonts w:ascii="Times New Roman" w:cs="Times New Roman" w:eastAsia="Times New Roman" w:hAnsi="Times New Roman"/>
-          <w:rtl w:val="0"/>
-        </w:rPr>
-        <w:t xml:space="preserve">Si todo es correcto, verás una confirmación de éxito.</w:t>
-      </w:r>
-    </w:p>
-    <w:p>
-      <w:pPr>
-        <w:numPr>
-          <w:ilvl w:val="0"/>
-          <w:numId w:val="4"/>
-        </w:numPr>
-        <w:spacing w:after="0" w:line="240" w:lineRule="auto"/>
-        <w:ind w:left="720" w:hanging="360"/>
-        <w:rPr>
-          <w:rFonts w:ascii="Times New Roman" w:cs="Times New Roman" w:eastAsia="Times New Roman" w:hAnsi="Times New Roman"/>
-          <w:sz w:val="22"/>
-          <w:szCs w:val="22"/>
-        </w:rPr>
-      </w:pPr>
-      <w:r>
-        <w:rPr>
-          <w:rFonts w:ascii="Times New Roman" w:cs="Times New Roman" w:eastAsia="Times New Roman" w:hAnsi="Times New Roman"/>
-          <w:rtl w:val="0"/>
-        </w:rPr>
-        <w:t xml:space="preserve">Si hay problemas, recibirás una advertencia. En ese caso, consulta las pestañas inferiores para identificar qué falló.</w:t>
+          <w:b w:val="1"/>
+          <w:bCs w:val="1"/>
+        </w:rPr>
+      </w:pPr>
+      <w:r>
+        <w:rPr>
+          <w:rtl w:val="0"/>
+        </w:rPr>
+      </w:r>
+    </w:p>
+    <w:p>
+      <w:pPr>
+        <w:rPr>
+          <w:rFonts w:ascii="Times New Roman" w:cs="Times New Roman" w:eastAsia="Times New Roman" w:hAnsi="Times New Roman"/>
+        </w:rPr>
+      </w:pPr>
+      <w:r>
+        <w:rPr>
+          <w:rtl w:val="0"/>
+        </w:rPr>
+      </w:r>
+    </w:p>
+    <w:p>
+      <w:pPr>
+        <w:rPr>
+          <w:rFonts w:ascii="Times New Roman" w:cs="Times New Roman" w:eastAsia="Times New Roman" w:hAnsi="Times New Roman"/>
+          <w:b w:val="1"/>
+          <w:bCs w:val="1"/>
+        </w:rPr>
+      </w:pPr>
+      <w:r>
+        <w:rPr>
+          <w:rFonts w:ascii="Times New Roman" w:cs="Times New Roman" w:eastAsia="Times New Roman" w:hAnsi="Times New Roman"/>
+          <w:b w:val="1"/>
+          <w:bCs w:val="1"/>
+          <w:rtl w:val="0"/>
+        </w:rPr>
+        <w:t xml:space="preserve">Paso 3: Compilación del código y generación de prompts</w:t>
+      </w:r>
+    </w:p>
+    <w:p>
+      <w:pPr>
+        <w:spacing w:after="0" w:line="240" w:lineRule="auto"/>
+        <w:rPr>
+          <w:rFonts w:ascii="Times New Roman" w:cs="Times New Roman" w:eastAsia="Times New Roman" w:hAnsi="Times New Roman"/>
+        </w:rPr>
+      </w:pPr>
+      <w:r>
+        <w:rPr>
+          <w:rFonts w:ascii="Times New Roman" w:cs="Times New Roman" w:eastAsia="Times New Roman" w:hAnsi="Times New Roman"/>
+          <w:rtl w:val="0"/>
+        </w:rPr>
+        <w:t xml:space="preserve">Puedes cargar tu </w:t>
+      </w:r>
+      <w:hyperlink r:id="rId12">
+        <w:r>
+          <w:rPr>
+            <w:rFonts w:ascii="Times New Roman" w:cs="Times New Roman" w:eastAsia="Times New Roman" w:hAnsi="Times New Roman"/>
+            <w:color w:val="1155cc"/>
+            <w:u w:val="single"/>
+            <w:rtl w:val="0"/>
+          </w:rPr>
+          <w:t xml:space="preserve">archivo.pz</w:t>
+        </w:r>
+      </w:hyperlink>
+      <w:r>
+        <w:rPr>
+          <w:rFonts w:ascii="Times New Roman" w:cs="Times New Roman" w:eastAsia="Times New Roman" w:hAnsi="Times New Roman"/>
+          <w:rtl w:val="0"/>
+        </w:rPr>
+        <w:t xml:space="preserve"> o escribir directamente en el editor de texto. Debes asegurarte de lo siguiente:</w:t>
+      </w:r>
+    </w:p>
+    <w:p>
+      <w:pPr>
+        <w:spacing w:after="0" w:line="240" w:lineRule="auto"/>
+        <w:rPr>
+          <w:rFonts w:ascii="Times New Roman" w:cs="Times New Roman" w:eastAsia="Times New Roman" w:hAnsi="Times New Roman"/>
+        </w:rPr>
+      </w:pPr>
+      <w:r>
+        <w:rPr>
+          <w:rtl w:val="0"/>
+        </w:rPr>
+      </w:r>
+    </w:p>
+    <w:p>
+      <w:pPr>
+        <w:spacing w:after="0" w:line="240" w:lineRule="auto"/>
+        <w:rPr>
+          <w:rFonts w:ascii="Times New Roman" w:cs="Times New Roman" w:eastAsia="Times New Roman" w:hAnsi="Times New Roman"/>
+        </w:rPr>
+      </w:pPr>
+      <w:r>
+        <w:rPr>
+          <w:rFonts w:ascii="Times New Roman" w:cs="Times New Roman" w:eastAsia="Times New Roman" w:hAnsi="Times New Roman"/>
+          <w:rtl w:val="0"/>
+        </w:rPr>
+        <w:t xml:space="preserve">1. Escribe tu código en el área del editor siguiendo la sintaxis del lenguaje PromptZal.</w:t>
+      </w:r>
+    </w:p>
+    <w:p>
+      <w:pPr>
+        <w:spacing w:after="0" w:line="240" w:lineRule="auto"/>
+        <w:rPr>
+          <w:rFonts w:ascii="Times New Roman" w:cs="Times New Roman" w:eastAsia="Times New Roman" w:hAnsi="Times New Roman"/>
+        </w:rPr>
+      </w:pPr>
+      <w:r>
+        <w:rPr>
+          <w:rFonts w:ascii="Times New Roman" w:cs="Times New Roman" w:eastAsia="Times New Roman" w:hAnsi="Times New Roman"/>
+          <w:rtl w:val="0"/>
+        </w:rPr>
+        <w:t xml:space="preserve">2. Asegúrate de incluir un bloque EJECUTAR y un bloque EXPORTAR al final de tu</w:t>
+      </w:r>
+    </w:p>
+    <w:p>
+      <w:pPr>
+        <w:spacing w:after="0" w:line="240" w:lineRule="auto"/>
+        <w:rPr>
+          <w:rFonts w:ascii="Times New Roman" w:cs="Times New Roman" w:eastAsia="Times New Roman" w:hAnsi="Times New Roman"/>
+        </w:rPr>
+      </w:pPr>
+      <w:r>
+        <w:rPr>
+          <w:rFonts w:ascii="Times New Roman" w:cs="Times New Roman" w:eastAsia="Times New Roman" w:hAnsi="Times New Roman"/>
+          <w:rtl w:val="0"/>
+        </w:rPr>
+        <w:t xml:space="preserve">código.</w:t>
+      </w:r>
+    </w:p>
+    <w:p>
+      <w:pPr>
+        <w:spacing w:after="0" w:line="240" w:lineRule="auto"/>
+        <w:rPr>
+          <w:rFonts w:ascii="Times New Roman" w:cs="Times New Roman" w:eastAsia="Times New Roman" w:hAnsi="Times New Roman"/>
+        </w:rPr>
+      </w:pPr>
+      <w:r>
+        <w:rPr>
+          <w:rFonts w:ascii="Times New Roman" w:cs="Times New Roman" w:eastAsia="Times New Roman" w:hAnsi="Times New Roman"/>
+          <w:rtl w:val="0"/>
+        </w:rPr>
+        <w:t xml:space="preserve">3. Presiona el botón Compilar. Si todo es correcto, aparecerá un mensaje de éxito. Si hay algo incorrecto te lo notificará</w:t>
+      </w:r>
+    </w:p>
+    <w:p>
+      <w:pPr>
+        <w:spacing w:after="0" w:line="240" w:lineRule="auto"/>
+        <w:rPr>
+          <w:rFonts w:ascii="Times New Roman" w:cs="Times New Roman" w:eastAsia="Times New Roman" w:hAnsi="Times New Roman"/>
+        </w:rPr>
+      </w:pPr>
+      <w:r>
+        <w:rPr>
+          <w:rFonts w:ascii="Times New Roman" w:cs="Times New Roman" w:eastAsia="Times New Roman" w:hAnsi="Times New Roman"/>
+          <w:rtl w:val="0"/>
+        </w:rPr>
+        <w:t xml:space="preserve">4. Si todo salió bien te aparecerá en pantalla una ventana con el prompt generado, o también puedes ir a la carpeta raíz ya que se genera un archivo.txt en el cual incluirá el prompt.</w:t>
       </w:r>
     </w:p>
     <w:p>
@@ -1650,18 +1909,18 @@
         </w:rPr>
         <w:drawing>
           <wp:inline distB="114300" distT="114300" distL="114300" distR="114300">
-            <wp:extent cx="5943600" cy="4572000"/>
+            <wp:extent cx="5943600" cy="5207000"/>
             <wp:effectExtent b="0" l="0" r="0" t="0"/>
-            <wp:docPr id="27" name="image4.png"/>
+            <wp:docPr id="31" name="image7.png"/>
             <a:graphic>
               <a:graphicData uri="http://schemas.openxmlformats.org/drawingml/2006/picture">
                 <pic:pic>
                   <pic:nvPicPr>
-                    <pic:cNvPr id="0" name="image4.png"/>
+                    <pic:cNvPr id="0" name="image7.png"/>
                     <pic:cNvPicPr preferRelativeResize="0"/>
                   </pic:nvPicPr>
                   <pic:blipFill>
-                    <a:blip r:embed="rId12"/>
+                    <a:blip r:embed="rId13"/>
                     <a:srcRect b="0" l="0" r="0" t="0"/>
                     <a:stretch>
                       <a:fillRect/>
@@ -1670,7 +1929,7 @@
                   <pic:spPr>
                     <a:xfrm>
                       <a:off x="0" y="0"/>
-                      <a:ext cx="5943600" cy="4572000"/>
+                      <a:ext cx="5943600" cy="5207000"/>
                     </a:xfrm>
                     <a:prstGeom prst="rect"/>
                     <a:ln/>
@@ -1700,9 +1959,59 @@
         </w:rPr>
         <w:drawing>
           <wp:inline distB="114300" distT="114300" distL="114300" distR="114300">
+            <wp:extent cx="5943600" cy="4152900"/>
+            <wp:effectExtent b="0" l="0" r="0" t="0"/>
+            <wp:docPr id="40" name="image2.png"/>
+            <a:graphic>
+              <a:graphicData uri="http://schemas.openxmlformats.org/drawingml/2006/picture">
+                <pic:pic>
+                  <pic:nvPicPr>
+                    <pic:cNvPr id="0" name="image2.png"/>
+                    <pic:cNvPicPr preferRelativeResize="0"/>
+                  </pic:nvPicPr>
+                  <pic:blipFill>
+                    <a:blip r:embed="rId14"/>
+                    <a:srcRect b="0" l="0" r="0" t="0"/>
+                    <a:stretch>
+                      <a:fillRect/>
+                    </a:stretch>
+                  </pic:blipFill>
+                  <pic:spPr>
+                    <a:xfrm>
+                      <a:off x="0" y="0"/>
+                      <a:ext cx="5943600" cy="4152900"/>
+                    </a:xfrm>
+                    <a:prstGeom prst="rect"/>
+                    <a:ln/>
+                  </pic:spPr>
+                </pic:pic>
+              </a:graphicData>
+            </a:graphic>
+          </wp:inline>
+        </w:drawing>
+      </w:r>
+      <w:r>
+        <w:rPr>
+          <w:rtl w:val="0"/>
+        </w:rPr>
+      </w:r>
+    </w:p>
+    <w:p>
+      <w:pPr>
+        <w:spacing w:after="0" w:line="240" w:lineRule="auto"/>
+        <w:rPr>
+          <w:rFonts w:ascii="Times New Roman" w:cs="Times New Roman" w:eastAsia="Times New Roman" w:hAnsi="Times New Roman"/>
+        </w:rPr>
+      </w:pPr>
+      <w:r>
+        <w:rPr>
+          <w:rFonts w:ascii="Times New Roman" w:cs="Times New Roman" w:eastAsia="Times New Roman" w:hAnsi="Times New Roman"/>
+        </w:rPr>
+        <w:drawing>
+          <wp:inline distB="114300" distT="114300" distL="114300" distR="114300">
             <wp:extent cx="2533650" cy="1228725"/>
             <wp:effectExtent b="0" l="0" r="0" t="0"/>
-            <wp:docPr id="23" name="image9.png"/>
+            <wp:docPr id="38" name="image9.png"/>
             <a:graphic>
               <a:graphicData uri="http://schemas.openxmlformats.org/drawingml/2006/picture">
                 <pic:pic>
@@ -1711,7 +2020,7 @@
                     <pic:cNvPicPr preferRelativeResize="0"/>
                   </pic:nvPicPr>
                   <pic:blipFill>
-                    <a:blip r:embed="rId13"/>
+                    <a:blip r:embed="rId15"/>
                     <a:srcRect b="0" l="0" r="0" t="0"/>
                     <a:stretch>
                       <a:fillRect/>
@@ -1737,319 +2046,14 @@
         </w:rPr>
         <w:drawing>
           <wp:inline distB="114300" distT="114300" distL="114300" distR="114300">
-            <wp:extent cx="2466975" cy="1114425"/>
+            <wp:extent cx="3086774" cy="1156543"/>
             <wp:effectExtent b="0" l="0" r="0" t="0"/>
-            <wp:docPr id="28" name="image7.png"/>
+            <wp:docPr id="42" name="image8.png"/>
             <a:graphic>
               <a:graphicData uri="http://schemas.openxmlformats.org/drawingml/2006/picture">
                 <pic:pic>
                   <pic:nvPicPr>
-                    <pic:cNvPr id="0" name="image7.png"/>
-                    <pic:cNvPicPr preferRelativeResize="0"/>
-                  </pic:nvPicPr>
-                  <pic:blipFill>
-                    <a:blip r:embed="rId14"/>
-                    <a:srcRect b="0" l="0" r="0" t="0"/>
-                    <a:stretch>
-                      <a:fillRect/>
-                    </a:stretch>
-                  </pic:blipFill>
-                  <pic:spPr>
-                    <a:xfrm>
-                      <a:off x="0" y="0"/>
-                      <a:ext cx="2466975" cy="1114425"/>
-                    </a:xfrm>
-                    <a:prstGeom prst="rect"/>
-                    <a:ln/>
-                  </pic:spPr>
-                </pic:pic>
-              </a:graphicData>
-            </a:graphic>
-          </wp:inline>
-        </w:drawing>
-      </w:r>
-      <w:r>
-        <w:rPr>
-          <w:rtl w:val="0"/>
-        </w:rPr>
-      </w:r>
-    </w:p>
-    <w:p>
-      <w:pPr>
-        <w:spacing w:after="0" w:line="240" w:lineRule="auto"/>
-        <w:rPr>
-          <w:rFonts w:ascii="Times New Roman" w:cs="Times New Roman" w:eastAsia="Times New Roman" w:hAnsi="Times New Roman"/>
-          <w:b w:val="1"/>
-          <w:bCs w:val="1"/>
-        </w:rPr>
-      </w:pPr>
-      <w:r>
-        <w:rPr>
-          <w:rtl w:val="0"/>
-        </w:rPr>
-      </w:r>
-    </w:p>
-    <w:p>
-      <w:pPr>
-        <w:spacing w:after="0" w:line="240" w:lineRule="auto"/>
-        <w:rPr>
-          <w:rFonts w:ascii="Times New Roman" w:cs="Times New Roman" w:eastAsia="Times New Roman" w:hAnsi="Times New Roman"/>
-          <w:b w:val="1"/>
-          <w:bCs w:val="1"/>
-        </w:rPr>
-      </w:pPr>
-      <w:r>
-        <w:rPr>
-          <w:rFonts w:ascii="Times New Roman" w:cs="Times New Roman" w:eastAsia="Times New Roman" w:hAnsi="Times New Roman"/>
-          <w:b w:val="1"/>
-          <w:bCs w:val="1"/>
-          <w:rtl w:val="0"/>
-        </w:rPr>
-        <w:t xml:space="preserve">Paso 4: Generación de Reportes y Grafo</w:t>
-      </w:r>
-    </w:p>
-    <w:p>
-      <w:pPr>
-        <w:spacing w:after="0" w:line="240" w:lineRule="auto"/>
-        <w:rPr>
-          <w:rFonts w:ascii="Times New Roman" w:cs="Times New Roman" w:eastAsia="Times New Roman" w:hAnsi="Times New Roman"/>
-        </w:rPr>
-      </w:pPr>
-      <w:r>
-        <w:rPr>
-          <w:rFonts w:ascii="Times New Roman" w:cs="Times New Roman" w:eastAsia="Times New Roman" w:hAnsi="Times New Roman"/>
-          <w:rtl w:val="0"/>
-        </w:rPr>
-        <w:t xml:space="preserve">Al presionar 'ReportesHTML', la aplicación creará automáticamente cuatro archivos esenciales en la carpeta de tu proyecto:</w:t>
-      </w:r>
-    </w:p>
-    <w:p>
-      <w:pPr>
-        <w:widowControl w:val="0"/>
-        <w:spacing w:after="0" w:line="240" w:lineRule="auto"/>
-        <w:rPr>
-          <w:rFonts w:ascii="Times New Roman" w:cs="Times New Roman" w:eastAsia="Times New Roman" w:hAnsi="Times New Roman"/>
-        </w:rPr>
-      </w:pPr>
-      <w:r>
-        <w:rPr>
-          <w:rtl w:val="0"/>
-        </w:rPr>
-      </w:r>
-    </w:p>
-    <w:p>
-      <w:pPr>
-        <w:numPr>
-          <w:ilvl w:val="0"/>
-          <w:numId w:val="2"/>
-        </w:numPr>
-        <w:spacing w:after="0" w:line="240" w:lineRule="auto"/>
-        <w:ind w:left="720" w:hanging="360"/>
-        <w:rPr>
-          <w:rFonts w:ascii="Arial" w:cs="Arial" w:eastAsia="Arial" w:hAnsi="Arial"/>
-          <w:sz w:val="22"/>
-          <w:szCs w:val="22"/>
-        </w:rPr>
-      </w:pPr>
-      <w:r>
-        <w:rPr>
-          <w:rFonts w:ascii="Times New Roman" w:cs="Times New Roman" w:eastAsia="Times New Roman" w:hAnsi="Times New Roman"/>
-          <w:b w:val="1"/>
-          <w:bCs w:val="1"/>
-          <w:rtl w:val="0"/>
-        </w:rPr>
-        <w:t xml:space="preserve">reporte_tokens.html:</w:t>
-      </w:r>
-      <w:r>
-        <w:rPr>
-          <w:rFonts w:ascii="Times New Roman" w:cs="Times New Roman" w:eastAsia="Times New Roman" w:hAnsi="Times New Roman"/>
-          <w:rtl w:val="0"/>
-        </w:rPr>
-        <w:t xml:space="preserve"> Lista de todos los elementos válidos.</w:t>
-      </w:r>
-    </w:p>
-    <w:p>
-      <w:pPr>
-        <w:numPr>
-          <w:ilvl w:val="0"/>
-          <w:numId w:val="2"/>
-        </w:numPr>
-        <w:spacing w:after="0" w:line="240" w:lineRule="auto"/>
-        <w:ind w:left="720" w:hanging="360"/>
-        <w:rPr>
-          <w:rFonts w:ascii="Arial" w:cs="Arial" w:eastAsia="Arial" w:hAnsi="Arial"/>
-          <w:sz w:val="22"/>
-          <w:szCs w:val="22"/>
-        </w:rPr>
-      </w:pPr>
-      <w:r>
-        <w:rPr>
-          <w:rFonts w:ascii="Times New Roman" w:cs="Times New Roman" w:eastAsia="Times New Roman" w:hAnsi="Times New Roman"/>
-          <w:b w:val="1"/>
-          <w:bCs w:val="1"/>
-          <w:rtl w:val="0"/>
-        </w:rPr>
-        <w:t xml:space="preserve">reporte_errores.html:</w:t>
-      </w:r>
-      <w:r>
-        <w:rPr>
-          <w:rFonts w:ascii="Times New Roman" w:cs="Times New Roman" w:eastAsia="Times New Roman" w:hAnsi="Times New Roman"/>
-          <w:rtl w:val="0"/>
-        </w:rPr>
-        <w:t xml:space="preserve"> Detalle de los fallos encontrados (línea, columna y descripción).</w:t>
-      </w:r>
-    </w:p>
-    <w:p>
-      <w:pPr>
-        <w:numPr>
-          <w:ilvl w:val="0"/>
-          <w:numId w:val="2"/>
-        </w:numPr>
-        <w:spacing w:after="0" w:line="240" w:lineRule="auto"/>
-        <w:ind w:left="720" w:hanging="360"/>
-        <w:rPr>
-          <w:rFonts w:ascii="Arial" w:cs="Arial" w:eastAsia="Arial" w:hAnsi="Arial"/>
-          <w:sz w:val="22"/>
-          <w:szCs w:val="22"/>
-        </w:rPr>
-      </w:pPr>
-      <w:r>
-        <w:rPr>
-          <w:rFonts w:ascii="Times New Roman" w:cs="Times New Roman" w:eastAsia="Times New Roman" w:hAnsi="Times New Roman"/>
-          <w:b w:val="1"/>
-          <w:bCs w:val="1"/>
-          <w:rtl w:val="0"/>
-        </w:rPr>
-        <w:t xml:space="preserve">reporte_estadisticas.html:</w:t>
-      </w:r>
-      <w:r>
-        <w:rPr>
-          <w:rFonts w:ascii="Times New Roman" w:cs="Times New Roman" w:eastAsia="Times New Roman" w:hAnsi="Times New Roman"/>
-          <w:rtl w:val="0"/>
-        </w:rPr>
-        <w:t xml:space="preserve"> Datos numéricos sobre el uso de componentes en tu código.</w:t>
-      </w:r>
-    </w:p>
-    <w:p>
-      <w:pPr>
-        <w:numPr>
-          <w:ilvl w:val="0"/>
-          <w:numId w:val="2"/>
-        </w:numPr>
-        <w:spacing w:after="0" w:line="240" w:lineRule="auto"/>
-        <w:ind w:left="720" w:hanging="360"/>
-        <w:rPr>
-          <w:rFonts w:ascii="Arial" w:cs="Arial" w:eastAsia="Arial" w:hAnsi="Arial"/>
-          <w:sz w:val="22"/>
-          <w:szCs w:val="22"/>
-        </w:rPr>
-      </w:pPr>
-      <w:r>
-        <w:rPr>
-          <w:rFonts w:ascii="Times New Roman" w:cs="Times New Roman" w:eastAsia="Times New Roman" w:hAnsi="Times New Roman"/>
-          <w:b w:val="1"/>
-          <w:bCs w:val="1"/>
-          <w:rtl w:val="0"/>
-        </w:rPr>
-        <w:t xml:space="preserve">Diagrama del Autómata:</w:t>
-      </w:r>
-      <w:r>
-        <w:rPr>
-          <w:rFonts w:ascii="Times New Roman" w:cs="Times New Roman" w:eastAsia="Times New Roman" w:hAnsi="Times New Roman"/>
-          <w:rtl w:val="0"/>
-        </w:rPr>
-        <w:t xml:space="preserve"> Una representación visual (generada con Graphviz) del proceso lógico seguido por el analizador (AFD).</w:t>
-      </w:r>
-    </w:p>
-    <w:p>
-      <w:pPr>
-        <w:rPr>
-          <w:rFonts w:ascii="Times New Roman" w:cs="Times New Roman" w:eastAsia="Times New Roman" w:hAnsi="Times New Roman"/>
-        </w:rPr>
-      </w:pPr>
-      <w:r>
-        <w:rPr>
-          <w:rFonts w:ascii="Times New Roman" w:cs="Times New Roman" w:eastAsia="Times New Roman" w:hAnsi="Times New Roman"/>
-        </w:rPr>
-        <w:drawing>
-          <wp:inline distB="114300" distT="114300" distL="114300" distR="114300">
-            <wp:extent cx="5943600" cy="4495800"/>
-            <wp:effectExtent b="0" l="0" r="0" t="0"/>
-            <wp:docPr id="29" name="image10.png"/>
-            <a:graphic>
-              <a:graphicData uri="http://schemas.openxmlformats.org/drawingml/2006/picture">
-                <pic:pic>
-                  <pic:nvPicPr>
-                    <pic:cNvPr id="0" name="image10.png"/>
-                    <pic:cNvPicPr preferRelativeResize="0"/>
-                  </pic:nvPicPr>
-                  <pic:blipFill>
-                    <a:blip r:embed="rId15"/>
-                    <a:srcRect b="0" l="0" r="0" t="0"/>
-                    <a:stretch>
-                      <a:fillRect/>
-                    </a:stretch>
-                  </pic:blipFill>
-                  <pic:spPr>
-                    <a:xfrm>
-                      <a:off x="0" y="0"/>
-                      <a:ext cx="5943600" cy="4495800"/>
-                    </a:xfrm>
-                    <a:prstGeom prst="rect"/>
-                    <a:ln/>
-                  </pic:spPr>
-                </pic:pic>
-              </a:graphicData>
-            </a:graphic>
-          </wp:inline>
-        </w:drawing>
-      </w:r>
-      <w:r>
-        <w:rPr>
-          <w:rtl w:val="0"/>
-        </w:rPr>
-      </w:r>
-    </w:p>
-    <w:p>
-      <w:pPr>
-        <w:spacing w:after="240" w:before="240" w:lineRule="auto"/>
-        <w:rPr>
-          <w:rFonts w:ascii="Times New Roman" w:cs="Times New Roman" w:eastAsia="Times New Roman" w:hAnsi="Times New Roman"/>
-          <w:b w:val="1"/>
-          <w:bCs w:val="1"/>
-        </w:rPr>
-      </w:pPr>
-      <w:r>
-        <w:rPr>
-          <w:rFonts w:ascii="Times New Roman" w:cs="Times New Roman" w:eastAsia="Times New Roman" w:hAnsi="Times New Roman"/>
-          <w:b w:val="1"/>
-          <w:bCs w:val="1"/>
-          <w:rtl w:val="0"/>
-        </w:rPr>
-        <w:t xml:space="preserve">IV. Tabla de Tokens</w:t>
-      </w:r>
-    </w:p>
-    <w:p>
-      <w:pPr>
-        <w:spacing w:after="240" w:before="240" w:lineRule="auto"/>
-        <w:rPr>
-          <w:rFonts w:ascii="Times New Roman" w:cs="Times New Roman" w:eastAsia="Times New Roman" w:hAnsi="Times New Roman"/>
-        </w:rPr>
-      </w:pPr>
-      <w:r>
-        <w:rPr>
-          <w:rFonts w:ascii="Times New Roman" w:cs="Times New Roman" w:eastAsia="Times New Roman" w:hAnsi="Times New Roman"/>
-        </w:rPr>
-        <w:drawing>
-          <wp:inline distB="114300" distT="114300" distL="114300" distR="114300">
-            <wp:extent cx="5943600" cy="2603500"/>
-            <wp:effectExtent b="0" l="0" r="0" t="0"/>
-            <wp:docPr id="24" name="image3.png"/>
-            <a:graphic>
-              <a:graphicData uri="http://schemas.openxmlformats.org/drawingml/2006/picture">
-                <pic:pic>
-                  <pic:nvPicPr>
-                    <pic:cNvPr id="0" name="image3.png"/>
+                    <pic:cNvPr id="0" name="image8.png"/>
                     <pic:cNvPicPr preferRelativeResize="0"/>
                   </pic:nvPicPr>
                   <pic:blipFill>
@@ -2062,7 +2066,7 @@
                   <pic:spPr>
                     <a:xfrm>
                       <a:off x="0" y="0"/>
-                      <a:ext cx="5943600" cy="2603500"/>
+                      <a:ext cx="3086774" cy="1156543"/>
                     </a:xfrm>
                     <a:prstGeom prst="rect"/>
                     <a:ln/>
@@ -2075,64 +2079,183 @@
       </w:r>
       <w:r>
         <w:rPr>
-          <w:rFonts w:ascii="Times New Roman" w:cs="Times New Roman" w:eastAsia="Times New Roman" w:hAnsi="Times New Roman"/>
-          <w:rtl w:val="0"/>
-        </w:rPr>
-        <w:t xml:space="preserve"> </w:t>
-      </w:r>
-    </w:p>
-    <w:p>
-      <w:pPr>
-        <w:rPr>
-          <w:rFonts w:ascii="Times New Roman" w:cs="Times New Roman" w:eastAsia="Times New Roman" w:hAnsi="Times New Roman"/>
-          <w:b w:val="1"/>
-          <w:bCs w:val="1"/>
-        </w:rPr>
-      </w:pPr>
-      <w:r>
-        <w:rPr>
-          <w:rtl w:val="0"/>
-        </w:rPr>
-      </w:r>
-    </w:p>
-    <w:p>
-      <w:pPr>
-        <w:rPr>
-          <w:rFonts w:ascii="Times New Roman" w:cs="Times New Roman" w:eastAsia="Times New Roman" w:hAnsi="Times New Roman"/>
-          <w:b w:val="1"/>
-          <w:bCs w:val="1"/>
-        </w:rPr>
-      </w:pPr>
-      <w:r>
-        <w:rPr>
-          <w:rFonts w:ascii="Times New Roman" w:cs="Times New Roman" w:eastAsia="Times New Roman" w:hAnsi="Times New Roman"/>
-          <w:b w:val="1"/>
-          <w:bCs w:val="1"/>
-          <w:rtl w:val="0"/>
-        </w:rPr>
-        <w:t xml:space="preserve">Casos de prueba:</w:t>
-      </w:r>
-    </w:p>
-    <w:p>
-      <w:pPr>
-        <w:spacing w:after="0" w:line="240" w:lineRule="auto"/>
-        <w:rPr>
-          <w:rFonts w:ascii="Times New Roman" w:cs="Times New Roman" w:eastAsia="Times New Roman" w:hAnsi="Times New Roman"/>
-        </w:rPr>
-      </w:pPr>
-      <w:r>
-        <w:rPr>
-          <w:rFonts w:ascii="Times New Roman" w:cs="Times New Roman" w:eastAsia="Times New Roman" w:hAnsi="Times New Roman"/>
-          <w:b w:val="1"/>
-          <w:bCs w:val="1"/>
-          <w:rtl w:val="0"/>
-        </w:rPr>
-        <w:t xml:space="preserve">Archivos Sin errores:</w:t>
-      </w:r>
-      <w:r>
-        <w:rPr>
-          <w:rtl w:val="0"/>
-        </w:rPr>
+          <w:rtl w:val="0"/>
+        </w:rPr>
+      </w:r>
+    </w:p>
+    <w:p>
+      <w:pPr>
+        <w:spacing w:after="0" w:line="240" w:lineRule="auto"/>
+        <w:rPr>
+          <w:rFonts w:ascii="Times New Roman" w:cs="Times New Roman" w:eastAsia="Times New Roman" w:hAnsi="Times New Roman"/>
+        </w:rPr>
+      </w:pPr>
+      <w:r>
+        <w:rPr>
+          <w:rtl w:val="0"/>
+        </w:rPr>
+      </w:r>
+    </w:p>
+    <w:p>
+      <w:pPr>
+        <w:spacing w:after="0" w:line="240" w:lineRule="auto"/>
+        <w:rPr>
+          <w:rFonts w:ascii="Times New Roman" w:cs="Times New Roman" w:eastAsia="Times New Roman" w:hAnsi="Times New Roman"/>
+        </w:rPr>
+      </w:pPr>
+      <w:r>
+        <w:rPr>
+          <w:rFonts w:ascii="Times New Roman" w:cs="Times New Roman" w:eastAsia="Times New Roman" w:hAnsi="Times New Roman"/>
+        </w:rPr>
+        <w:drawing>
+          <wp:inline distB="114300" distT="114300" distL="114300" distR="114300">
+            <wp:extent cx="5943600" cy="1104900"/>
+            <wp:effectExtent b="0" l="0" r="0" t="0"/>
+            <wp:docPr id="43" name="image6.png"/>
+            <a:graphic>
+              <a:graphicData uri="http://schemas.openxmlformats.org/drawingml/2006/picture">
+                <pic:pic>
+                  <pic:nvPicPr>
+                    <pic:cNvPr id="0" name="image6.png"/>
+                    <pic:cNvPicPr preferRelativeResize="0"/>
+                  </pic:nvPicPr>
+                  <pic:blipFill>
+                    <a:blip r:embed="rId17"/>
+                    <a:srcRect b="0" l="0" r="0" t="0"/>
+                    <a:stretch>
+                      <a:fillRect/>
+                    </a:stretch>
+                  </pic:blipFill>
+                  <pic:spPr>
+                    <a:xfrm>
+                      <a:off x="0" y="0"/>
+                      <a:ext cx="5943600" cy="1104900"/>
+                    </a:xfrm>
+                    <a:prstGeom prst="rect"/>
+                    <a:ln/>
+                  </pic:spPr>
+                </pic:pic>
+              </a:graphicData>
+            </a:graphic>
+          </wp:inline>
+        </w:drawing>
+      </w:r>
+      <w:r>
+        <w:rPr>
+          <w:rtl w:val="0"/>
+        </w:rPr>
+      </w:r>
+    </w:p>
+    <w:p>
+      <w:pPr>
+        <w:spacing w:after="0" w:line="240" w:lineRule="auto"/>
+        <w:rPr>
+          <w:rFonts w:ascii="Times New Roman" w:cs="Times New Roman" w:eastAsia="Times New Roman" w:hAnsi="Times New Roman"/>
+        </w:rPr>
+      </w:pPr>
+      <w:r>
+        <w:rPr>
+          <w:rFonts w:ascii="Times New Roman" w:cs="Times New Roman" w:eastAsia="Times New Roman" w:hAnsi="Times New Roman"/>
+        </w:rPr>
+        <w:drawing>
+          <wp:inline distB="114300" distT="114300" distL="114300" distR="114300">
+            <wp:extent cx="5943600" cy="990600"/>
+            <wp:effectExtent b="0" l="0" r="0" t="0"/>
+            <wp:docPr id="44" name="image12.png"/>
+            <a:graphic>
+              <a:graphicData uri="http://schemas.openxmlformats.org/drawingml/2006/picture">
+                <pic:pic>
+                  <pic:nvPicPr>
+                    <pic:cNvPr id="0" name="image12.png"/>
+                    <pic:cNvPicPr preferRelativeResize="0"/>
+                  </pic:nvPicPr>
+                  <pic:blipFill>
+                    <a:blip r:embed="rId18"/>
+                    <a:srcRect b="0" l="0" r="0" t="0"/>
+                    <a:stretch>
+                      <a:fillRect/>
+                    </a:stretch>
+                  </pic:blipFill>
+                  <pic:spPr>
+                    <a:xfrm>
+                      <a:off x="0" y="0"/>
+                      <a:ext cx="5943600" cy="990600"/>
+                    </a:xfrm>
+                    <a:prstGeom prst="rect"/>
+                    <a:ln/>
+                  </pic:spPr>
+                </pic:pic>
+              </a:graphicData>
+            </a:graphic>
+          </wp:inline>
+        </w:drawing>
+      </w:r>
+      <w:r>
+        <w:rPr>
+          <w:rtl w:val="0"/>
+        </w:rPr>
+      </w:r>
+    </w:p>
+    <w:p>
+      <w:pPr>
+        <w:spacing w:after="0" w:line="240" w:lineRule="auto"/>
+        <w:rPr>
+          <w:rFonts w:ascii="Times New Roman" w:cs="Times New Roman" w:eastAsia="Times New Roman" w:hAnsi="Times New Roman"/>
+        </w:rPr>
+      </w:pPr>
+      <w:r>
+        <w:rPr>
+          <w:rtl w:val="0"/>
+        </w:rPr>
+      </w:r>
+    </w:p>
+    <w:p>
+      <w:pPr>
+        <w:spacing w:after="0" w:line="240" w:lineRule="auto"/>
+        <w:rPr>
+          <w:rFonts w:ascii="Times New Roman" w:cs="Times New Roman" w:eastAsia="Times New Roman" w:hAnsi="Times New Roman"/>
+          <w:b w:val="1"/>
+          <w:bCs w:val="1"/>
+        </w:rPr>
+      </w:pPr>
+      <w:r>
+        <w:rPr>
+          <w:rtl w:val="0"/>
+        </w:rPr>
+      </w:r>
+    </w:p>
+    <w:p>
+      <w:pPr>
+        <w:spacing w:after="0" w:line="240" w:lineRule="auto"/>
+        <w:rPr>
+          <w:rFonts w:ascii="Times New Roman" w:cs="Times New Roman" w:eastAsia="Times New Roman" w:hAnsi="Times New Roman"/>
+          <w:b w:val="1"/>
+          <w:bCs w:val="1"/>
+        </w:rPr>
+      </w:pPr>
+      <w:r>
+        <w:rPr>
+          <w:rFonts w:ascii="Times New Roman" w:cs="Times New Roman" w:eastAsia="Times New Roman" w:hAnsi="Times New Roman"/>
+          <w:b w:val="1"/>
+          <w:bCs w:val="1"/>
+          <w:rtl w:val="0"/>
+        </w:rPr>
+        <w:t xml:space="preserve">Paso 4: Generación de Reportes y Árbol</w:t>
+      </w:r>
+    </w:p>
+    <w:p>
+      <w:pPr>
+        <w:spacing w:after="0" w:line="240" w:lineRule="auto"/>
+        <w:rPr>
+          <w:rFonts w:ascii="Times New Roman" w:cs="Times New Roman" w:eastAsia="Times New Roman" w:hAnsi="Times New Roman"/>
+        </w:rPr>
+      </w:pPr>
+      <w:r>
+        <w:rPr>
+          <w:rFonts w:ascii="Times New Roman" w:cs="Times New Roman" w:eastAsia="Times New Roman" w:hAnsi="Times New Roman"/>
+          <w:rtl w:val="0"/>
+        </w:rPr>
+        <w:t xml:space="preserve">Al presionar 'Reportes’', la aplicación creará automáticamente dos archivos esenciales en la carpeta de tu proyecto:</w:t>
       </w:r>
     </w:p>
     <w:p>
@@ -2153,7 +2276,7 @@
       <w:pPr>
         <w:numPr>
           <w:ilvl w:val="0"/>
-          <w:numId w:val="5"/>
+          <w:numId w:val="2"/>
         </w:numPr>
         <w:spacing w:after="0" w:line="240" w:lineRule="auto"/>
         <w:ind w:left="720" w:hanging="360"/>
@@ -2166,23 +2289,30 @@
       <w:r>
         <w:rPr>
           <w:rFonts w:ascii="Times New Roman" w:cs="Times New Roman" w:eastAsia="Times New Roman" w:hAnsi="Times New Roman"/>
-          <w:rtl w:val="0"/>
-        </w:rPr>
-        <w:t xml:space="preserve">analisis_combate.pz</w:t>
-      </w:r>
-      <w:r>
-        <w:rPr>
-          <w:rFonts w:ascii="Times New Roman" w:cs="Times New Roman" w:eastAsia="Times New Roman" w:hAnsi="Times New Roman"/>
-          <w:rtl w:val="0"/>
-        </w:rPr>
-        <w:t xml:space="preserve">: Ejemplo complejo de lógica de combate para agentes.</w:t>
+          <w:b w:val="1"/>
+          <w:bCs w:val="1"/>
+          <w:rtl w:val="0"/>
+        </w:rPr>
+        <w:t xml:space="preserve">reporte_simbolos:</w:t>
+      </w:r>
+      <w:r>
+        <w:rPr>
+          <w:rFonts w:ascii="Times New Roman" w:cs="Times New Roman" w:eastAsia="Times New Roman" w:hAnsi="Times New Roman"/>
+          <w:rtl w:val="0"/>
+        </w:rPr>
+        <w:t xml:space="preserve"> Lista de todos los símbolos</w:t>
+      </w:r>
+      <w:r>
+        <w:rPr>
+          <w:rtl w:val="0"/>
+        </w:rPr>
       </w:r>
     </w:p>
     <w:p>
       <w:pPr>
         <w:numPr>
           <w:ilvl w:val="0"/>
-          <w:numId w:val="5"/>
+          <w:numId w:val="2"/>
         </w:numPr>
         <w:spacing w:after="0" w:line="240" w:lineRule="auto"/>
         <w:ind w:left="720" w:hanging="360"/>
@@ -2195,154 +2325,340 @@
       <w:r>
         <w:rPr>
           <w:rFonts w:ascii="Times New Roman" w:cs="Times New Roman" w:eastAsia="Times New Roman" w:hAnsi="Times New Roman"/>
-          <w:rtl w:val="0"/>
-        </w:rPr>
-        <w:t xml:space="preserve">agente_secreto.pz</w:t>
-      </w:r>
-      <w:r>
-        <w:rPr>
-          <w:rFonts w:ascii="Times New Roman" w:cs="Times New Roman" w:eastAsia="Times New Roman" w:hAnsi="Times New Roman"/>
-          <w:rtl w:val="0"/>
-        </w:rPr>
-        <w:t xml:space="preserve">: Configuración de roles y misiones.</w:t>
-      </w:r>
-    </w:p>
-    <w:p>
-      <w:pPr>
-        <w:numPr>
-          <w:ilvl w:val="0"/>
-          <w:numId w:val="5"/>
-        </w:numPr>
-        <w:spacing w:after="0" w:line="240" w:lineRule="auto"/>
-        <w:ind w:left="720" w:hanging="360"/>
+          <w:b w:val="1"/>
+          <w:bCs w:val="1"/>
+          <w:rtl w:val="0"/>
+        </w:rPr>
+        <w:t xml:space="preserve">reporte_errores.html:</w:t>
+      </w:r>
+      <w:r>
+        <w:rPr>
+          <w:rFonts w:ascii="Times New Roman" w:cs="Times New Roman" w:eastAsia="Times New Roman" w:hAnsi="Times New Roman"/>
+          <w:rtl w:val="0"/>
+        </w:rPr>
+        <w:t xml:space="preserve"> Detalle de los fallos encontrados (tipo, descripción, línea, y columna).</w:t>
+      </w:r>
+      <w:r>
+        <w:rPr>
+          <w:rtl w:val="0"/>
+        </w:rPr>
+      </w:r>
+    </w:p>
+    <w:p>
+      <w:pPr>
+        <w:rPr>
+          <w:rFonts w:ascii="Times New Roman" w:cs="Times New Roman" w:eastAsia="Times New Roman" w:hAnsi="Times New Roman"/>
+        </w:rPr>
+      </w:pPr>
+      <w:r>
+        <w:rPr>
+          <w:rFonts w:ascii="Times New Roman" w:cs="Times New Roman" w:eastAsia="Times New Roman" w:hAnsi="Times New Roman"/>
+        </w:rPr>
+        <w:drawing>
+          <wp:inline distB="114300" distT="114300" distL="114300" distR="114300">
+            <wp:extent cx="5553075" cy="1400175"/>
+            <wp:effectExtent b="0" l="0" r="0" t="0"/>
+            <wp:docPr id="34" name="image15.png"/>
+            <a:graphic>
+              <a:graphicData uri="http://schemas.openxmlformats.org/drawingml/2006/picture">
+                <pic:pic>
+                  <pic:nvPicPr>
+                    <pic:cNvPr id="0" name="image15.png"/>
+                    <pic:cNvPicPr preferRelativeResize="0"/>
+                  </pic:nvPicPr>
+                  <pic:blipFill>
+                    <a:blip r:embed="rId19"/>
+                    <a:srcRect b="0" l="0" r="0" t="0"/>
+                    <a:stretch>
+                      <a:fillRect/>
+                    </a:stretch>
+                  </pic:blipFill>
+                  <pic:spPr>
+                    <a:xfrm>
+                      <a:off x="0" y="0"/>
+                      <a:ext cx="5553075" cy="1400175"/>
+                    </a:xfrm>
+                    <a:prstGeom prst="rect"/>
+                    <a:ln/>
+                  </pic:spPr>
+                </pic:pic>
+              </a:graphicData>
+            </a:graphic>
+          </wp:inline>
+        </w:drawing>
+      </w:r>
+      <w:r>
+        <w:rPr>
+          <w:rtl w:val="0"/>
+        </w:rPr>
+      </w:r>
+    </w:p>
+    <w:p>
+      <w:pPr>
+        <w:rPr>
+          <w:rFonts w:ascii="Times New Roman" w:cs="Times New Roman" w:eastAsia="Times New Roman" w:hAnsi="Times New Roman"/>
+        </w:rPr>
+      </w:pPr>
+      <w:r>
+        <w:rPr>
+          <w:rFonts w:ascii="Times New Roman" w:cs="Times New Roman" w:eastAsia="Times New Roman" w:hAnsi="Times New Roman"/>
+          <w:rtl w:val="0"/>
+        </w:rPr>
+        <w:t xml:space="preserve">Al presionar ‘Ver AST’, la aplicación te mostrará la imagen del AST generado.</w:t>
+      </w:r>
+    </w:p>
+    <w:p>
+      <w:pPr>
+        <w:rPr>
+          <w:rFonts w:ascii="Times New Roman" w:cs="Times New Roman" w:eastAsia="Times New Roman" w:hAnsi="Times New Roman"/>
+        </w:rPr>
+      </w:pPr>
+      <w:r>
+        <w:rPr>
+          <w:rFonts w:ascii="Times New Roman" w:cs="Times New Roman" w:eastAsia="Times New Roman" w:hAnsi="Times New Roman"/>
+        </w:rPr>
+        <w:drawing>
+          <wp:inline distB="114300" distT="114300" distL="114300" distR="114300">
+            <wp:extent cx="5943600" cy="3225800"/>
+            <wp:effectExtent b="0" l="0" r="0" t="0"/>
+            <wp:docPr id="41" name="image13.png"/>
+            <a:graphic>
+              <a:graphicData uri="http://schemas.openxmlformats.org/drawingml/2006/picture">
+                <pic:pic>
+                  <pic:nvPicPr>
+                    <pic:cNvPr id="0" name="image13.png"/>
+                    <pic:cNvPicPr preferRelativeResize="0"/>
+                  </pic:nvPicPr>
+                  <pic:blipFill>
+                    <a:blip r:embed="rId20"/>
+                    <a:srcRect b="0" l="0" r="0" t="0"/>
+                    <a:stretch>
+                      <a:fillRect/>
+                    </a:stretch>
+                  </pic:blipFill>
+                  <pic:spPr>
+                    <a:xfrm>
+                      <a:off x="0" y="0"/>
+                      <a:ext cx="5943600" cy="3225800"/>
+                    </a:xfrm>
+                    <a:prstGeom prst="rect"/>
+                    <a:ln/>
+                  </pic:spPr>
+                </pic:pic>
+              </a:graphicData>
+            </a:graphic>
+          </wp:inline>
+        </w:drawing>
+      </w:r>
+      <w:r>
+        <w:rPr>
+          <w:rtl w:val="0"/>
+        </w:rPr>
+      </w:r>
+    </w:p>
+    <w:p>
+      <w:pPr>
+        <w:rPr>
+          <w:rFonts w:ascii="Times New Roman" w:cs="Times New Roman" w:eastAsia="Times New Roman" w:hAnsi="Times New Roman"/>
+        </w:rPr>
+      </w:pPr>
+      <w:r>
+        <w:rPr>
+          <w:rtl w:val="0"/>
+        </w:rPr>
+      </w:r>
+    </w:p>
+    <w:p>
+      <w:pPr>
+        <w:rPr>
+          <w:rFonts w:ascii="Times New Roman" w:cs="Times New Roman" w:eastAsia="Times New Roman" w:hAnsi="Times New Roman"/>
+        </w:rPr>
+      </w:pPr>
+      <w:r>
+        <w:rPr>
+          <w:rtl w:val="0"/>
+        </w:rPr>
+      </w:r>
+    </w:p>
+    <w:p>
+      <w:pPr>
+        <w:rPr>
+          <w:rFonts w:ascii="Times New Roman" w:cs="Times New Roman" w:eastAsia="Times New Roman" w:hAnsi="Times New Roman"/>
+        </w:rPr>
+      </w:pPr>
+      <w:r>
+        <w:rPr>
+          <w:rtl w:val="0"/>
+        </w:rPr>
+      </w:r>
+    </w:p>
+    <w:p>
+      <w:pPr>
+        <w:rPr>
+          <w:rFonts w:ascii="Times New Roman" w:cs="Times New Roman" w:eastAsia="Times New Roman" w:hAnsi="Times New Roman"/>
+        </w:rPr>
+      </w:pPr>
+      <w:r>
+        <w:rPr>
+          <w:rtl w:val="0"/>
+        </w:rPr>
+      </w:r>
+    </w:p>
+    <w:p>
+      <w:pPr>
+        <w:rPr>
+          <w:rFonts w:ascii="Times New Roman" w:cs="Times New Roman" w:eastAsia="Times New Roman" w:hAnsi="Times New Roman"/>
+        </w:rPr>
+      </w:pPr>
+      <w:r>
+        <w:rPr>
+          <w:rtl w:val="0"/>
+        </w:rPr>
+      </w:r>
+    </w:p>
+    <w:p>
+      <w:pPr>
+        <w:spacing w:after="240" w:before="240" w:lineRule="auto"/>
+        <w:rPr>
+          <w:rFonts w:ascii="Times New Roman" w:cs="Times New Roman" w:eastAsia="Times New Roman" w:hAnsi="Times New Roman"/>
+          <w:b w:val="1"/>
+          <w:bCs w:val="1"/>
+        </w:rPr>
+      </w:pPr>
+      <w:r>
+        <w:rPr>
+          <w:rFonts w:ascii="Times New Roman" w:cs="Times New Roman" w:eastAsia="Times New Roman" w:hAnsi="Times New Roman"/>
+          <w:b w:val="1"/>
+          <w:bCs w:val="1"/>
+          <w:rtl w:val="0"/>
+        </w:rPr>
+        <w:t xml:space="preserve">IV. Tabla de Terminales</w:t>
+      </w:r>
+    </w:p>
+    <w:p>
+      <w:pPr>
+        <w:spacing w:after="240" w:before="240" w:lineRule="auto"/>
+        <w:rPr>
+          <w:rFonts w:ascii="Times New Roman" w:cs="Times New Roman" w:eastAsia="Times New Roman" w:hAnsi="Times New Roman"/>
+        </w:rPr>
+      </w:pPr>
+      <w:r>
+        <w:rPr>
+          <w:rFonts w:ascii="Times New Roman" w:cs="Times New Roman" w:eastAsia="Times New Roman" w:hAnsi="Times New Roman"/>
+        </w:rPr>
+        <w:drawing>
+          <wp:inline distB="114300" distT="114300" distL="114300" distR="114300">
+            <wp:extent cx="5943600" cy="2730500"/>
+            <wp:effectExtent b="0" l="0" r="0" t="0"/>
+            <wp:docPr id="30" name="image4.png"/>
+            <a:graphic>
+              <a:graphicData uri="http://schemas.openxmlformats.org/drawingml/2006/picture">
+                <pic:pic>
+                  <pic:nvPicPr>
+                    <pic:cNvPr id="0" name="image4.png"/>
+                    <pic:cNvPicPr preferRelativeResize="0"/>
+                  </pic:nvPicPr>
+                  <pic:blipFill>
+                    <a:blip r:embed="rId21"/>
+                    <a:srcRect b="0" l="0" r="0" t="0"/>
+                    <a:stretch>
+                      <a:fillRect/>
+                    </a:stretch>
+                  </pic:blipFill>
+                  <pic:spPr>
+                    <a:xfrm>
+                      <a:off x="0" y="0"/>
+                      <a:ext cx="5943600" cy="2730500"/>
+                    </a:xfrm>
+                    <a:prstGeom prst="rect"/>
+                    <a:ln/>
+                  </pic:spPr>
+                </pic:pic>
+              </a:graphicData>
+            </a:graphic>
+          </wp:inline>
+        </w:drawing>
+      </w:r>
+      <w:r>
+        <w:rPr>
+          <w:rtl w:val="0"/>
+        </w:rPr>
+      </w:r>
+    </w:p>
+    <w:p>
+      <w:pPr>
+        <w:spacing w:after="240" w:before="240" w:lineRule="auto"/>
+        <w:rPr>
+          <w:rFonts w:ascii="Times New Roman" w:cs="Times New Roman" w:eastAsia="Times New Roman" w:hAnsi="Times New Roman"/>
+        </w:rPr>
+      </w:pPr>
+      <w:r>
+        <w:rPr>
+          <w:rFonts w:ascii="Times New Roman" w:cs="Times New Roman" w:eastAsia="Times New Roman" w:hAnsi="Times New Roman"/>
+        </w:rPr>
+        <w:drawing>
+          <wp:inline distB="114300" distT="114300" distL="114300" distR="114300">
+            <wp:extent cx="5943600" cy="2413000"/>
+            <wp:effectExtent b="0" l="0" r="0" t="0"/>
+            <wp:docPr id="32" name="image5.png"/>
+            <a:graphic>
+              <a:graphicData uri="http://schemas.openxmlformats.org/drawingml/2006/picture">
+                <pic:pic>
+                  <pic:nvPicPr>
+                    <pic:cNvPr id="0" name="image5.png"/>
+                    <pic:cNvPicPr preferRelativeResize="0"/>
+                  </pic:nvPicPr>
+                  <pic:blipFill>
+                    <a:blip r:embed="rId22"/>
+                    <a:srcRect b="0" l="0" r="0" t="0"/>
+                    <a:stretch>
+                      <a:fillRect/>
+                    </a:stretch>
+                  </pic:blipFill>
+                  <pic:spPr>
+                    <a:xfrm>
+                      <a:off x="0" y="0"/>
+                      <a:ext cx="5943600" cy="2413000"/>
+                    </a:xfrm>
+                    <a:prstGeom prst="rect"/>
+                    <a:ln/>
+                  </pic:spPr>
+                </pic:pic>
+              </a:graphicData>
+            </a:graphic>
+          </wp:inline>
+        </w:drawing>
+      </w:r>
+      <w:r>
+        <w:rPr>
+          <w:rtl w:val="0"/>
+        </w:rPr>
+      </w:r>
+    </w:p>
+    <w:p>
+      <w:pPr>
+        <w:rPr>
+          <w:rFonts w:ascii="Times New Roman" w:cs="Times New Roman" w:eastAsia="Times New Roman" w:hAnsi="Times New Roman"/>
+          <w:b w:val="1"/>
+          <w:bCs w:val="1"/>
+        </w:rPr>
+      </w:pPr>
+      <w:r>
+        <w:rPr>
+          <w:rtl w:val="0"/>
+        </w:rPr>
+      </w:r>
+    </w:p>
+    <w:p>
+      <w:pPr>
+        <w:spacing w:after="0" w:line="240" w:lineRule="auto"/>
+        <w:ind w:left="0" w:firstLine="0"/>
         <w:rPr>
           <w:rFonts w:ascii="Arial" w:cs="Arial" w:eastAsia="Arial" w:hAnsi="Arial"/>
           <w:sz w:val="22"/>
           <w:szCs w:val="22"/>
         </w:rPr>
       </w:pPr>
-      <w:r>
-        <w:rPr>
-          <w:rFonts w:ascii="Times New Roman" w:cs="Times New Roman" w:eastAsia="Times New Roman" w:hAnsi="Times New Roman"/>
-          <w:rtl w:val="0"/>
-        </w:rPr>
-        <w:t xml:space="preserve">reporte_topografia.pz</w:t>
-      </w:r>
-      <w:r>
-        <w:rPr>
-          <w:rFonts w:ascii="Times New Roman" w:cs="Times New Roman" w:eastAsia="Times New Roman" w:hAnsi="Times New Roman"/>
-          <w:rtl w:val="0"/>
-        </w:rPr>
-        <w:t xml:space="preserve">: Uso de datos numéricos y estructuras descriptivas.</w:t>
-      </w:r>
-    </w:p>
-    <w:p>
-      <w:pPr>
-        <w:widowControl w:val="0"/>
-        <w:spacing w:after="0" w:line="240" w:lineRule="auto"/>
-        <w:rPr>
-          <w:rFonts w:ascii="Times New Roman" w:cs="Times New Roman" w:eastAsia="Times New Roman" w:hAnsi="Times New Roman"/>
-        </w:rPr>
-      </w:pPr>
-      <w:r>
-        <w:rPr>
-          <w:rtl w:val="0"/>
-        </w:rPr>
-      </w:r>
-    </w:p>
-    <w:p>
-      <w:pPr>
-        <w:spacing w:after="0" w:line="240" w:lineRule="auto"/>
-        <w:rPr>
-          <w:rFonts w:ascii="Times New Roman" w:cs="Times New Roman" w:eastAsia="Times New Roman" w:hAnsi="Times New Roman"/>
-        </w:rPr>
-      </w:pPr>
-      <w:r>
-        <w:rPr>
-          <w:rFonts w:ascii="Times New Roman" w:cs="Times New Roman" w:eastAsia="Times New Roman" w:hAnsi="Times New Roman"/>
-          <w:b w:val="1"/>
-          <w:bCs w:val="1"/>
-          <w:rtl w:val="0"/>
-        </w:rPr>
-        <w:t xml:space="preserve">Archivos con Errores:</w:t>
-      </w:r>
-      <w:r>
-        <w:rPr>
-          <w:rtl w:val="0"/>
-        </w:rPr>
-      </w:r>
-    </w:p>
-    <w:p>
-      <w:pPr>
-        <w:widowControl w:val="0"/>
-        <w:spacing w:after="0" w:line="240" w:lineRule="auto"/>
-        <w:rPr>
-          <w:rFonts w:ascii="Times New Roman" w:cs="Times New Roman" w:eastAsia="Times New Roman" w:hAnsi="Times New Roman"/>
-        </w:rPr>
-      </w:pPr>
-      <w:r>
-        <w:rPr>
-          <w:rtl w:val="0"/>
-        </w:rPr>
-      </w:r>
-    </w:p>
-    <w:p>
-      <w:pPr>
-        <w:numPr>
-          <w:ilvl w:val="0"/>
-          <w:numId w:val="5"/>
-        </w:numPr>
-        <w:spacing w:after="0" w:line="240" w:lineRule="auto"/>
-        <w:ind w:left="720" w:hanging="360"/>
-        <w:rPr>
-          <w:rFonts w:ascii="Arial" w:cs="Arial" w:eastAsia="Arial" w:hAnsi="Arial"/>
-          <w:sz w:val="22"/>
-          <w:szCs w:val="22"/>
-        </w:rPr>
-      </w:pPr>
-      <w:r>
-        <w:rPr>
-          <w:rFonts w:ascii="Times New Roman" w:cs="Times New Roman" w:eastAsia="Times New Roman" w:hAnsi="Times New Roman"/>
-          <w:rtl w:val="0"/>
-        </w:rPr>
-        <w:t xml:space="preserve">diagnostico_errores.pz</w:t>
-      </w:r>
-      <w:r>
-        <w:rPr>
-          <w:rFonts w:ascii="Times New Roman" w:cs="Times New Roman" w:eastAsia="Times New Roman" w:hAnsi="Times New Roman"/>
-          <w:rtl w:val="0"/>
-        </w:rPr>
-        <w:t xml:space="preserve">: Contiene diversos fallos para probar la resistencia del analizador.</w:t>
-      </w:r>
-    </w:p>
-    <w:p>
-      <w:pPr>
-        <w:numPr>
-          <w:ilvl w:val="0"/>
-          <w:numId w:val="5"/>
-        </w:numPr>
-        <w:spacing w:after="0" w:line="240" w:lineRule="auto"/>
-        <w:ind w:left="720" w:hanging="360"/>
-        <w:rPr>
-          <w:rFonts w:ascii="Arial" w:cs="Arial" w:eastAsia="Arial" w:hAnsi="Arial"/>
-          <w:sz w:val="22"/>
-          <w:szCs w:val="22"/>
-        </w:rPr>
-      </w:pPr>
-      <w:r>
-        <w:rPr>
-          <w:rFonts w:ascii="Times New Roman" w:cs="Times New Roman" w:eastAsia="Times New Roman" w:hAnsi="Times New Roman"/>
-          <w:rtl w:val="0"/>
-        </w:rPr>
-        <w:t xml:space="preserve">cuidador_canino(error).pz</w:t>
-      </w:r>
-      <w:r>
-        <w:rPr>
-          <w:rFonts w:ascii="Times New Roman" w:cs="Times New Roman" w:eastAsia="Times New Roman" w:hAnsi="Times New Roman"/>
-          <w:rtl w:val="0"/>
-        </w:rPr>
-        <w:t xml:space="preserve">: Un caso práctico con errores específicos en la definición de atributos.</w:t>
-      </w:r>
       <w:r>
         <w:rPr>
           <w:rtl w:val="0"/>
@@ -2697,34 +3013,34 @@
       <w:lvlText w:val="●"/>
       <w:lvlJc w:val="left"/>
       <w:pPr>
-        <w:ind w:left="720" w:hanging="360"/>
-      </w:pPr>
-      <w:rPr>
-        <w:u w:val="none"/>
+        <w:ind w:left="780" w:hanging="360"/>
+      </w:pPr>
+      <w:rPr>
+        <w:rFonts w:ascii="Noto Sans Symbols" w:cs="Noto Sans Symbols" w:eastAsia="Noto Sans Symbols" w:hAnsi="Noto Sans Symbols"/>
       </w:rPr>
     </w:lvl>
     <w:lvl w:ilvl="1">
       <w:start w:val="1"/>
       <w:numFmt w:val="bullet"/>
-      <w:lvlText w:val="○"/>
-      <w:lvlJc w:val="left"/>
-      <w:pPr>
-        <w:ind w:left="1440" w:hanging="360"/>
-      </w:pPr>
-      <w:rPr>
-        <w:u w:val="none"/>
+      <w:lvlText w:val="o"/>
+      <w:lvlJc w:val="left"/>
+      <w:pPr>
+        <w:ind w:left="1500" w:hanging="360"/>
+      </w:pPr>
+      <w:rPr>
+        <w:rFonts w:ascii="Courier New" w:cs="Courier New" w:eastAsia="Courier New" w:hAnsi="Courier New"/>
       </w:rPr>
     </w:lvl>
     <w:lvl w:ilvl="2">
       <w:start w:val="1"/>
       <w:numFmt w:val="bullet"/>
-      <w:lvlText w:val="■"/>
-      <w:lvlJc w:val="left"/>
-      <w:pPr>
-        <w:ind w:left="2160" w:hanging="360"/>
-      </w:pPr>
-      <w:rPr>
-        <w:u w:val="none"/>
+      <w:lvlText w:val="▪"/>
+      <w:lvlJc w:val="left"/>
+      <w:pPr>
+        <w:ind w:left="2220" w:hanging="360"/>
+      </w:pPr>
+      <w:rPr>
+        <w:rFonts w:ascii="Noto Sans Symbols" w:cs="Noto Sans Symbols" w:eastAsia="Noto Sans Symbols" w:hAnsi="Noto Sans Symbols"/>
       </w:rPr>
     </w:lvl>
     <w:lvl w:ilvl="3">
@@ -2733,34 +3049,34 @@
       <w:lvlText w:val="●"/>
       <w:lvlJc w:val="left"/>
       <w:pPr>
-        <w:ind w:left="2880" w:hanging="360"/>
-      </w:pPr>
-      <w:rPr>
-        <w:u w:val="none"/>
+        <w:ind w:left="2940" w:hanging="360"/>
+      </w:pPr>
+      <w:rPr>
+        <w:rFonts w:ascii="Noto Sans Symbols" w:cs="Noto Sans Symbols" w:eastAsia="Noto Sans Symbols" w:hAnsi="Noto Sans Symbols"/>
       </w:rPr>
     </w:lvl>
     <w:lvl w:ilvl="4">
       <w:start w:val="1"/>
       <w:numFmt w:val="bullet"/>
-      <w:lvlText w:val="○"/>
-      <w:lvlJc w:val="left"/>
-      <w:pPr>
-        <w:ind w:left="3600" w:hanging="360"/>
-      </w:pPr>
-      <w:rPr>
-        <w:u w:val="none"/>
+      <w:lvlText w:val="o"/>
+      <w:lvlJc w:val="left"/>
+      <w:pPr>
+        <w:ind w:left="3660" w:hanging="360"/>
+      </w:pPr>
+      <w:rPr>
+        <w:rFonts w:ascii="Courier New" w:cs="Courier New" w:eastAsia="Courier New" w:hAnsi="Courier New"/>
       </w:rPr>
     </w:lvl>
     <w:lvl w:ilvl="5">
       <w:start w:val="1"/>
       <w:numFmt w:val="bullet"/>
-      <w:lvlText w:val="■"/>
-      <w:lvlJc w:val="left"/>
-      <w:pPr>
-        <w:ind w:left="4320" w:hanging="360"/>
-      </w:pPr>
-      <w:rPr>
-        <w:u w:val="none"/>
+      <w:lvlText w:val="▪"/>
+      <w:lvlJc w:val="left"/>
+      <w:pPr>
+        <w:ind w:left="4380" w:hanging="360"/>
+      </w:pPr>
+      <w:rPr>
+        <w:rFonts w:ascii="Noto Sans Symbols" w:cs="Noto Sans Symbols" w:eastAsia="Noto Sans Symbols" w:hAnsi="Noto Sans Symbols"/>
       </w:rPr>
     </w:lvl>
     <w:lvl w:ilvl="6">
@@ -2769,258 +3085,38 @@
       <w:lvlText w:val="●"/>
       <w:lvlJc w:val="left"/>
       <w:pPr>
-        <w:ind w:left="5040" w:hanging="360"/>
-      </w:pPr>
-      <w:rPr>
-        <w:u w:val="none"/>
+        <w:ind w:left="5100" w:hanging="360"/>
+      </w:pPr>
+      <w:rPr>
+        <w:rFonts w:ascii="Noto Sans Symbols" w:cs="Noto Sans Symbols" w:eastAsia="Noto Sans Symbols" w:hAnsi="Noto Sans Symbols"/>
       </w:rPr>
     </w:lvl>
     <w:lvl w:ilvl="7">
       <w:start w:val="1"/>
       <w:numFmt w:val="bullet"/>
-      <w:lvlText w:val="○"/>
-      <w:lvlJc w:val="left"/>
-      <w:pPr>
-        <w:ind w:left="5760" w:hanging="360"/>
-      </w:pPr>
-      <w:rPr>
-        <w:u w:val="none"/>
+      <w:lvlText w:val="o"/>
+      <w:lvlJc w:val="left"/>
+      <w:pPr>
+        <w:ind w:left="5820" w:hanging="360"/>
+      </w:pPr>
+      <w:rPr>
+        <w:rFonts w:ascii="Courier New" w:cs="Courier New" w:eastAsia="Courier New" w:hAnsi="Courier New"/>
       </w:rPr>
     </w:lvl>
     <w:lvl w:ilvl="8">
       <w:start w:val="1"/>
       <w:numFmt w:val="bullet"/>
-      <w:lvlText w:val="■"/>
-      <w:lvlJc w:val="left"/>
-      <w:pPr>
-        <w:ind w:left="6480" w:hanging="360"/>
-      </w:pPr>
-      <w:rPr>
-        <w:u w:val="none"/>
+      <w:lvlText w:val="▪"/>
+      <w:lvlJc w:val="left"/>
+      <w:pPr>
+        <w:ind w:left="6540" w:hanging="360"/>
+      </w:pPr>
+      <w:rPr>
+        <w:rFonts w:ascii="Noto Sans Symbols" w:cs="Noto Sans Symbols" w:eastAsia="Noto Sans Symbols" w:hAnsi="Noto Sans Symbols"/>
       </w:rPr>
     </w:lvl>
   </w:abstractNum>
   <w:abstractNum w:abstractNumId="5">
-    <w:lvl w:ilvl="0">
-      <w:start w:val="1"/>
-      <w:numFmt w:val="bullet"/>
-      <w:lvlText w:val="●"/>
-      <w:lvlJc w:val="left"/>
-      <w:pPr>
-        <w:ind w:left="720" w:hanging="360"/>
-      </w:pPr>
-      <w:rPr>
-        <w:u w:val="none"/>
-      </w:rPr>
-    </w:lvl>
-    <w:lvl w:ilvl="1">
-      <w:start w:val="1"/>
-      <w:numFmt w:val="bullet"/>
-      <w:lvlText w:val="○"/>
-      <w:lvlJc w:val="left"/>
-      <w:pPr>
-        <w:ind w:left="1440" w:hanging="360"/>
-      </w:pPr>
-      <w:rPr>
-        <w:u w:val="none"/>
-      </w:rPr>
-    </w:lvl>
-    <w:lvl w:ilvl="2">
-      <w:start w:val="1"/>
-      <w:numFmt w:val="bullet"/>
-      <w:lvlText w:val="■"/>
-      <w:lvlJc w:val="left"/>
-      <w:pPr>
-        <w:ind w:left="2160" w:hanging="360"/>
-      </w:pPr>
-      <w:rPr>
-        <w:u w:val="none"/>
-      </w:rPr>
-    </w:lvl>
-    <w:lvl w:ilvl="3">
-      <w:start w:val="1"/>
-      <w:numFmt w:val="bullet"/>
-      <w:lvlText w:val="●"/>
-      <w:lvlJc w:val="left"/>
-      <w:pPr>
-        <w:ind w:left="2880" w:hanging="360"/>
-      </w:pPr>
-      <w:rPr>
-        <w:u w:val="none"/>
-      </w:rPr>
-    </w:lvl>
-    <w:lvl w:ilvl="4">
-      <w:start w:val="1"/>
-      <w:numFmt w:val="bullet"/>
-      <w:lvlText w:val="○"/>
-      <w:lvlJc w:val="left"/>
-      <w:pPr>
-        <w:ind w:left="3600" w:hanging="360"/>
-      </w:pPr>
-      <w:rPr>
-        <w:u w:val="none"/>
-      </w:rPr>
-    </w:lvl>
-    <w:lvl w:ilvl="5">
-      <w:start w:val="1"/>
-      <w:numFmt w:val="bullet"/>
-      <w:lvlText w:val="■"/>
-      <w:lvlJc w:val="left"/>
-      <w:pPr>
-        <w:ind w:left="4320" w:hanging="360"/>
-      </w:pPr>
-      <w:rPr>
-        <w:u w:val="none"/>
-      </w:rPr>
-    </w:lvl>
-    <w:lvl w:ilvl="6">
-      <w:start w:val="1"/>
-      <w:numFmt w:val="bullet"/>
-      <w:lvlText w:val="●"/>
-      <w:lvlJc w:val="left"/>
-      <w:pPr>
-        <w:ind w:left="5040" w:hanging="360"/>
-      </w:pPr>
-      <w:rPr>
-        <w:u w:val="none"/>
-      </w:rPr>
-    </w:lvl>
-    <w:lvl w:ilvl="7">
-      <w:start w:val="1"/>
-      <w:numFmt w:val="bullet"/>
-      <w:lvlText w:val="○"/>
-      <w:lvlJc w:val="left"/>
-      <w:pPr>
-        <w:ind w:left="5760" w:hanging="360"/>
-      </w:pPr>
-      <w:rPr>
-        <w:u w:val="none"/>
-      </w:rPr>
-    </w:lvl>
-    <w:lvl w:ilvl="8">
-      <w:start w:val="1"/>
-      <w:numFmt w:val="bullet"/>
-      <w:lvlText w:val="■"/>
-      <w:lvlJc w:val="left"/>
-      <w:pPr>
-        <w:ind w:left="6480" w:hanging="360"/>
-      </w:pPr>
-      <w:rPr>
-        <w:u w:val="none"/>
-      </w:rPr>
-    </w:lvl>
-  </w:abstractNum>
-  <w:abstractNum w:abstractNumId="6">
-    <w:lvl w:ilvl="0">
-      <w:start w:val="1"/>
-      <w:numFmt w:val="bullet"/>
-      <w:lvlText w:val="●"/>
-      <w:lvlJc w:val="left"/>
-      <w:pPr>
-        <w:ind w:left="780" w:hanging="360"/>
-      </w:pPr>
-      <w:rPr>
-        <w:rFonts w:ascii="Noto Sans Symbols" w:cs="Noto Sans Symbols" w:eastAsia="Noto Sans Symbols" w:hAnsi="Noto Sans Symbols"/>
-      </w:rPr>
-    </w:lvl>
-    <w:lvl w:ilvl="1">
-      <w:start w:val="1"/>
-      <w:numFmt w:val="bullet"/>
-      <w:lvlText w:val="o"/>
-      <w:lvlJc w:val="left"/>
-      <w:pPr>
-        <w:ind w:left="1500" w:hanging="360"/>
-      </w:pPr>
-      <w:rPr>
-        <w:rFonts w:ascii="Courier New" w:cs="Courier New" w:eastAsia="Courier New" w:hAnsi="Courier New"/>
-      </w:rPr>
-    </w:lvl>
-    <w:lvl w:ilvl="2">
-      <w:start w:val="1"/>
-      <w:numFmt w:val="bullet"/>
-      <w:lvlText w:val="▪"/>
-      <w:lvlJc w:val="left"/>
-      <w:pPr>
-        <w:ind w:left="2220" w:hanging="360"/>
-      </w:pPr>
-      <w:rPr>
-        <w:rFonts w:ascii="Noto Sans Symbols" w:cs="Noto Sans Symbols" w:eastAsia="Noto Sans Symbols" w:hAnsi="Noto Sans Symbols"/>
-      </w:rPr>
-    </w:lvl>
-    <w:lvl w:ilvl="3">
-      <w:start w:val="1"/>
-      <w:numFmt w:val="bullet"/>
-      <w:lvlText w:val="●"/>
-      <w:lvlJc w:val="left"/>
-      <w:pPr>
-        <w:ind w:left="2940" w:hanging="360"/>
-      </w:pPr>
-      <w:rPr>
-        <w:rFonts w:ascii="Noto Sans Symbols" w:cs="Noto Sans Symbols" w:eastAsia="Noto Sans Symbols" w:hAnsi="Noto Sans Symbols"/>
-      </w:rPr>
-    </w:lvl>
-    <w:lvl w:ilvl="4">
-      <w:start w:val="1"/>
-      <w:numFmt w:val="bullet"/>
-      <w:lvlText w:val="o"/>
-      <w:lvlJc w:val="left"/>
-      <w:pPr>
-        <w:ind w:left="3660" w:hanging="360"/>
-      </w:pPr>
-      <w:rPr>
-        <w:rFonts w:ascii="Courier New" w:cs="Courier New" w:eastAsia="Courier New" w:hAnsi="Courier New"/>
-      </w:rPr>
-    </w:lvl>
-    <w:lvl w:ilvl="5">
-      <w:start w:val="1"/>
-      <w:numFmt w:val="bullet"/>
-      <w:lvlText w:val="▪"/>
-      <w:lvlJc w:val="left"/>
-      <w:pPr>
-        <w:ind w:left="4380" w:hanging="360"/>
-      </w:pPr>
-      <w:rPr>
-        <w:rFonts w:ascii="Noto Sans Symbols" w:cs="Noto Sans Symbols" w:eastAsia="Noto Sans Symbols" w:hAnsi="Noto Sans Symbols"/>
-      </w:rPr>
-    </w:lvl>
-    <w:lvl w:ilvl="6">
-      <w:start w:val="1"/>
-      <w:numFmt w:val="bullet"/>
-      <w:lvlText w:val="●"/>
-      <w:lvlJc w:val="left"/>
-      <w:pPr>
-        <w:ind w:left="5100" w:hanging="360"/>
-      </w:pPr>
-      <w:rPr>
-        <w:rFonts w:ascii="Noto Sans Symbols" w:cs="Noto Sans Symbols" w:eastAsia="Noto Sans Symbols" w:hAnsi="Noto Sans Symbols"/>
-      </w:rPr>
-    </w:lvl>
-    <w:lvl w:ilvl="7">
-      <w:start w:val="1"/>
-      <w:numFmt w:val="bullet"/>
-      <w:lvlText w:val="o"/>
-      <w:lvlJc w:val="left"/>
-      <w:pPr>
-        <w:ind w:left="5820" w:hanging="360"/>
-      </w:pPr>
-      <w:rPr>
-        <w:rFonts w:ascii="Courier New" w:cs="Courier New" w:eastAsia="Courier New" w:hAnsi="Courier New"/>
-      </w:rPr>
-    </w:lvl>
-    <w:lvl w:ilvl="8">
-      <w:start w:val="1"/>
-      <w:numFmt w:val="bullet"/>
-      <w:lvlText w:val="▪"/>
-      <w:lvlJc w:val="left"/>
-      <w:pPr>
-        <w:ind w:left="6540" w:hanging="360"/>
-      </w:pPr>
-      <w:rPr>
-        <w:rFonts w:ascii="Noto Sans Symbols" w:cs="Noto Sans Symbols" w:eastAsia="Noto Sans Symbols" w:hAnsi="Noto Sans Symbols"/>
-      </w:rPr>
-    </w:lvl>
-  </w:abstractNum>
-  <w:abstractNum w:abstractNumId="7">
     <w:lvl w:ilvl="0">
       <w:start w:val="1"/>
       <w:numFmt w:val="bullet"/>
@@ -3144,12 +3240,6 @@
   </w:num>
   <w:num w:numId="5">
     <w:abstractNumId w:val="5"/>
-  </w:num>
-  <w:num w:numId="6">
-    <w:abstractNumId w:val="6"/>
-  </w:num>
-  <w:num w:numId="7">
-    <w:abstractNumId w:val="7"/>
   </w:num>
 </w:numbering>
 </file>
@@ -3287,6 +3377,20 @@
       <w:sz w:val="56"/>
       <w:szCs w:val="56"/>
     </w:rPr>
+  </w:style>
+  <w:style w:type="table" w:styleId="TableNormal" w:default="1">
+    <w:name w:val="TableNormal"/>
+    <w:tblPr>
+      <w:tblCellMar>
+        <w:top w:w="100.0" w:type="dxa"/>
+        <w:left w:w="100.0" w:type="dxa"/>
+        <w:bottom w:w="100.0" w:type="dxa"/>
+        <w:right w:w="100.0" w:type="dxa"/>
+      </w:tblCellMar>
+    </w:tblPr>
+  </w:style>
+  <w:style w:type="paragraph" w:styleId="Normal" w:default="1">
+    <w:name w:val="normal"/>
   </w:style>
   <w:style w:type="table" w:styleId="TableNormal" w:default="1">
     <w:name w:val="TableNormal"/>
@@ -3652,7 +3756,7 @@
 
 <file path=customXML/item1.xml><?xml version="1.0" encoding="utf-8"?>
 <go:gDocsCustomXmlDataStorage xmlns:go="http://customooxmlschemas.google.com/" xmlns:r="http://schemas.openxmlformats.org/officeDocument/2006/relationships" uri="GoogleDocsCustomDataVersion2">
-  <go:docsCustomData xmlns:go="http://customooxmlschemas.google.com/" roundtripDataSignature="AMtx7mj2fJIXgpOU1Qe1w2L55F9e1gXSSg==">CgMxLjA4AHIhMVBzZlA0bFVfTWxjMEJSNHNvZ2pfVTZWOXNGd0RUR2Jn</go:docsCustomData>
+  <go:docsCustomData xmlns:go="http://customooxmlschemas.google.com/" roundtripDataSignature="AMtx7miudwPpPDxJd6keHItCgJnGzQXmeg==">CgMxLjA4AHIhMU1Ra3hEZ0FhaVR1N0dWYWNhS013MFFQZGFlMlVsQ0Z5</go:docsCustomData>
 </go:gDocsCustomXmlDataStorage>
 </file>
 

</xml_diff>